<commit_message>
2.126.2: wervingspagina's vindbaar - canonical, sitemap.xml, robots.txt, [[pagina_url]]
- pag_indexeerbaar(): gepubliceerd + vinkje + nooit op test; gebruikt door de robots-meta, X-Robots-Tag en de sitemap
- Canonical automatisch als het ontwerp er zelf geen heeft
- sitemap.php en robots.php via rewrite (.htaccess); test: Disallow /
- Markering [[pagina_url]] (absoluut adres) voor og:image/og:url/JSON-LD
- Handleiding wervingspagina's bijgewerkt
</commit_message>
<xml_diff>
--- a/docs/handleiding/word/landingspaginas.docx
+++ b/docs/handleiding/word/landingspaginas.docx
@@ -1443,6 +1443,113 @@
           </w:p>
         </w:tc>
       </w:tr>
+      <w:tr>
+        <w:tc>
+          <w:tcPr/>
+          <w:p>
+            <w:pPr>
+              <w:pStyle w:val="Compact"/>
+            </w:pPr>
+            <w:r>
+              <w:rPr>
+                <w:rStyle w:val="VerbatimChar"/>
+                <w:lang w:val="nl"/>
+              </w:rPr>
+              <w:t xml:space="preserve">[[pagina_url]]</w:t>
+            </w:r>
+          </w:p>
+        </w:tc>
+        <w:tc>
+          <w:tcPr/>
+          <w:p>
+            <w:pPr>
+              <w:pStyle w:val="Compact"/>
+            </w:pPr>
+            <w:r>
+              <w:rPr>
+                <w:lang w:val="nl"/>
+              </w:rPr>
+              <w:t xml:space="preserve">Het volledige adres van deze pagina, bijvoorbeeld</w:t>
+            </w:r>
+            <w:r>
+              <w:rPr>
+                <w:lang w:val="nl"/>
+              </w:rPr>
+              <w:t xml:space="preserve"> </w:t>
+            </w:r>
+            <w:r>
+              <w:rPr>
+                <w:rStyle w:val="VerbatimChar"/>
+                <w:lang w:val="nl"/>
+              </w:rPr>
+              <w:t xml:space="preserve">https://sollicitatie.paal13.com/p/zomer-2027</w:t>
+            </w:r>
+            <w:r>
+              <w:rPr>
+                <w:lang w:val="nl"/>
+              </w:rPr>
+              <w:t xml:space="preserve">. Nodig voor</w:t>
+            </w:r>
+            <w:r>
+              <w:rPr>
+                <w:lang w:val="nl"/>
+              </w:rPr>
+              <w:t xml:space="preserve"> </w:t>
+            </w:r>
+            <w:r>
+              <w:rPr>
+                <w:rStyle w:val="VerbatimChar"/>
+                <w:lang w:val="nl"/>
+              </w:rPr>
+              <w:t xml:space="preserve">og:url</w:t>
+            </w:r>
+            <w:r>
+              <w:rPr>
+                <w:lang w:val="nl"/>
+              </w:rPr>
+              <w:t xml:space="preserve">,</w:t>
+            </w:r>
+            <w:r>
+              <w:rPr>
+                <w:lang w:val="nl"/>
+              </w:rPr>
+              <w:t xml:space="preserve"> </w:t>
+            </w:r>
+            <w:r>
+              <w:rPr>
+                <w:rStyle w:val="VerbatimChar"/>
+                <w:lang w:val="nl"/>
+              </w:rPr>
+              <w:t xml:space="preserve">og:image</w:t>
+            </w:r>
+            <w:r>
+              <w:rPr>
+                <w:lang w:val="nl"/>
+              </w:rPr>
+              <w:t xml:space="preserve"> </w:t>
+            </w:r>
+            <w:r>
+              <w:rPr>
+                <w:lang w:val="nl"/>
+              </w:rPr>
+              <w:t xml:space="preserve">(</w:t>
+            </w:r>
+            <w:r>
+              <w:rPr>
+                <w:rStyle w:val="VerbatimChar"/>
+                <w:lang w:val="nl"/>
+              </w:rPr>
+              <w:t xml:space="preserve">[[pagina_url]]/deel-foto.jpg</w:t>
+            </w:r>
+            <w:r>
+              <w:rPr>
+                <w:lang w:val="nl"/>
+              </w:rPr>
+              <w:t xml:space="preserve">) en structured data: daar werkt een los bestandsnaam niet</w:t>
+            </w:r>
+          </w:p>
+        </w:tc>
+      </w:tr>
     </w:tbl>
     <w:p>
       <w:pPr>
@@ -3831,112 +3938,7 @@
         <w:rPr>
           <w:lang w:val="nl"/>
         </w:rPr>
-        <w:t xml:space="preserve">aan.</w:t>
-      </w:r>
-    </w:p>
-    <w:p>
-      <w:pPr>
-        <w:pStyle w:val="BodyText"/>
-      </w:pPr>
-      <w:r>
-        <w:rPr>
-          <w:lang w:val="nl"/>
-        </w:rPr>
-        <w:t xml:space="preserve">In het overzicht staat</w:t>
-      </w:r>
-      <w:r>
-        <w:rPr>
-          <w:lang w:val="nl"/>
-        </w:rPr>
-        <w:t xml:space="preserve"> </w:t>
-      </w:r>
-      <w:r>
-        <w:rPr>
-          <w:b/>
-          <w:bCs/>
-          <w:lang w:val="nl"/>
-        </w:rPr>
-        <w:t xml:space="preserve">Geen ontwerp</w:t>
-      </w:r>
-      <w:r>
-        <w:rPr>
-          <w:lang w:val="nl"/>
-        </w:rPr>
-        <w:t xml:space="preserve"> </w:t>
-      </w:r>
-      <w:r>
-        <w:rPr>
-          <w:lang w:val="nl"/>
-        </w:rPr>
-        <w:t xml:space="preserve">bij een pagina waarop nog geen versie live staat.</w:t>
-      </w:r>
-    </w:p>
-    <w:p>
-      <w:r>
-        <w:pict>
-          <v:rect style="width:0;height:1.5pt" o:hralign="center" o:hrstd="t" o:hr="t"/>
-        </w:pict>
-      </w:r>
-    </w:p>
-    <w:bookmarkEnd w:id="17"/>
-    <w:bookmarkStart w:id="18" w:name="cijfers-waar-haken-mensen-af"/>
-    <w:p>
-      <w:pPr>
-        <w:pStyle w:val="Heading1"/>
-      </w:pPr>
-      <w:r>
-        <w:rPr>
-          <w:lang w:val="nl"/>
-        </w:rPr>
-        <w:t xml:space="preserve">Cijfers: waar haken mensen af?</w:t>
-      </w:r>
-    </w:p>
-    <w:p>
-      <w:pPr>
-        <w:pStyle w:val="BlockText"/>
-      </w:pPr>
-      <w:r>
-        <w:rPr>
-          <w:b/>
-          <w:bCs/>
-          <w:lang w:val="nl"/>
-        </w:rPr>
-        <w:t xml:space="preserve">In het kort:</w:t>
-      </w:r>
-      <w:r>
-        <w:rPr>
-          <w:lang w:val="nl"/>
-        </w:rPr>
-        <w:t xml:space="preserve"> </w:t>
-      </w:r>
-      <w:r>
-        <w:rPr>
-          <w:lang w:val="nl"/>
-        </w:rPr>
-        <w:t xml:space="preserve">per pagina zie je bezoekers, bezoeken, aanmeldingen en omzetting, en een</w:t>
-      </w:r>
-      <w:r>
-        <w:rPr>
-          <w:lang w:val="nl"/>
-        </w:rPr>
-        <w:t xml:space="preserve"> </w:t>
-      </w:r>
-      <w:r>
-        <w:rPr>
-          <w:lang w:val="nl"/>
-        </w:rPr>
-        <w:t xml:space="preserve">trechter die laat zien bij welke stap van het formulier mensen stoppen.</w:t>
-      </w:r>
-    </w:p>
-    <w:p>
-      <w:pPr>
-        <w:pStyle w:val="FirstParagraph"/>
-      </w:pPr>
-      <w:r>
-        <w:rPr>
-          <w:lang w:val="nl"/>
-        </w:rPr>
-        <w:t xml:space="preserve">Bovenaan een pagina, en per pagina in het overzicht, staan vier cijfers:</w:t>
+        <w:t xml:space="preserve">aan. Dan gebeurt er automatisch nog meer:</w:t>
       </w:r>
     </w:p>
     <w:p>
@@ -3949,61 +3951,79 @@
       </w:pPr>
       <w:r>
         <w:rPr>
-          <w:b/>
-          <w:bCs/>
-          <w:lang w:val="nl"/>
-        </w:rPr>
-        <w:t xml:space="preserve">Unieke bezoekers</w:t>
-      </w:r>
-      <w:r>
-        <w:rPr>
-          <w:lang w:val="nl"/>
-        </w:rPr>
-        <w:t xml:space="preserve"> </w:t>
-      </w:r>
-      <w:r>
-        <w:rPr>
-          <w:lang w:val="nl"/>
-        </w:rPr>
-        <w:t xml:space="preserve">en</w:t>
-      </w:r>
-      <w:r>
-        <w:rPr>
-          <w:lang w:val="nl"/>
-        </w:rPr>
-        <w:t xml:space="preserve"> </w:t>
-      </w:r>
-      <w:r>
-        <w:rPr>
-          <w:b/>
-          <w:bCs/>
-          <w:lang w:val="nl"/>
-        </w:rPr>
-        <w:t xml:space="preserve">Bezoeken</w:t>
-      </w:r>
-      <w:r>
-        <w:rPr>
-          <w:lang w:val="nl"/>
-        </w:rPr>
-        <w:t xml:space="preserve"> </w:t>
-      </w:r>
-      <w:r>
-        <w:rPr>
-          <w:lang w:val="nl"/>
-        </w:rPr>
-        <w:t xml:space="preserve">(dezelfde bezoeker telt hooguit eens per 30 minuten als</w:t>
-      </w:r>
-      <w:r>
-        <w:rPr>
-          <w:lang w:val="nl"/>
-        </w:rPr>
-        <w:t xml:space="preserve"> </w:t>
-      </w:r>
-      <w:r>
-        <w:rPr>
-          <w:lang w:val="nl"/>
-        </w:rPr>
-        <w:t xml:space="preserve">bezoek);</w:t>
+          <w:lang w:val="nl"/>
+        </w:rPr>
+        <w:t xml:space="preserve">de pagina krijgt een</w:t>
+      </w:r>
+      <w:r>
+        <w:rPr>
+          <w:lang w:val="nl"/>
+        </w:rPr>
+        <w:t xml:space="preserve"> </w:t>
+      </w:r>
+      <w:r>
+        <w:rPr>
+          <w:b/>
+          <w:bCs/>
+          <w:lang w:val="nl"/>
+        </w:rPr>
+        <w:t xml:space="preserve">canonical</w:t>
+      </w:r>
+      <w:r>
+        <w:rPr>
+          <w:lang w:val="nl"/>
+        </w:rPr>
+        <w:t xml:space="preserve">-adres (</w:t>
+      </w:r>
+      <w:r>
+        <w:rPr>
+          <w:rStyle w:val="VerbatimChar"/>
+          <w:lang w:val="nl"/>
+        </w:rPr>
+        <w:t xml:space="preserve">/p/&lt;adres&gt;</w:t>
+      </w:r>
+      <w:r>
+        <w:rPr>
+          <w:lang w:val="nl"/>
+        </w:rPr>
+        <w:t xml:space="preserve">, zonder</w:t>
+      </w:r>
+      <w:r>
+        <w:rPr>
+          <w:lang w:val="nl"/>
+        </w:rPr>
+        <w:t xml:space="preserve"> </w:t>
+      </w:r>
+      <w:r>
+        <w:rPr>
+          <w:rStyle w:val="VerbatimChar"/>
+          <w:lang w:val="nl"/>
+        </w:rPr>
+        <w:t xml:space="preserve">?bron=</w:t>
+      </w:r>
+      <w:r>
+        <w:rPr>
+          <w:lang w:val="nl"/>
+        </w:rPr>
+        <w:t xml:space="preserve"> </w:t>
+      </w:r>
+      <w:r>
+        <w:rPr>
+          <w:lang w:val="nl"/>
+        </w:rPr>
+        <w:t xml:space="preserve">of andere toevoegingen),</w:t>
+      </w:r>
+      <w:r>
+        <w:rPr>
+          <w:lang w:val="nl"/>
+        </w:rPr>
+        <w:t xml:space="preserve"> </w:t>
+      </w:r>
+      <w:r>
+        <w:rPr>
+          <w:lang w:val="nl"/>
+        </w:rPr>
+        <w:t xml:space="preserve">tenzij het ontwerp er zelf een heeft;</w:t>
       </w:r>
     </w:p>
     <w:p>
@@ -4016,40 +4036,67 @@
       </w:pPr>
       <w:r>
         <w:rPr>
-          <w:b/>
-          <w:bCs/>
-          <w:lang w:val="nl"/>
-        </w:rPr>
-        <w:t xml:space="preserve">Aanmeldingen</w:t>
-      </w:r>
-      <w:r>
-        <w:rPr>
-          <w:lang w:val="nl"/>
-        </w:rPr>
-        <w:t xml:space="preserve">: verstuurde formulieren;</w:t>
-      </w:r>
-    </w:p>
-    <w:p>
-      <w:pPr>
-        <w:pStyle w:val="Compact"/>
-        <w:numPr>
-          <w:ilvl w:val="0"/>
-          <w:numId w:val="1005"/>
-        </w:numPr>
-      </w:pPr>
-      <w:r>
-        <w:rPr>
-          <w:b/>
-          <w:bCs/>
-          <w:lang w:val="nl"/>
-        </w:rPr>
-        <w:t xml:space="preserve">Omzetting</w:t>
-      </w:r>
-      <w:r>
-        <w:rPr>
-          <w:lang w:val="nl"/>
-        </w:rPr>
-        <w:t xml:space="preserve">: aanmeldingen gedeeld door unieke bezoekers.</w:t>
+          <w:lang w:val="nl"/>
+        </w:rPr>
+        <w:t xml:space="preserve">de pagina komt in</w:t>
+      </w:r>
+      <w:r>
+        <w:rPr>
+          <w:lang w:val="nl"/>
+        </w:rPr>
+        <w:t xml:space="preserve"> </w:t>
+      </w:r>
+      <w:r>
+        <w:rPr>
+          <w:rStyle w:val="VerbatimChar"/>
+          <w:b/>
+          <w:bCs/>
+          <w:lang w:val="nl"/>
+        </w:rPr>
+        <w:t xml:space="preserve">/sitemap.xml</w:t>
+      </w:r>
+      <w:r>
+        <w:rPr>
+          <w:lang w:val="nl"/>
+        </w:rPr>
+        <w:t xml:space="preserve">, waar Google hem vindt, en</w:t>
+      </w:r>
+      <w:r>
+        <w:rPr>
+          <w:lang w:val="nl"/>
+        </w:rPr>
+        <w:t xml:space="preserve"> </w:t>
+      </w:r>
+      <w:r>
+        <w:rPr>
+          <w:rStyle w:val="VerbatimChar"/>
+          <w:lang w:val="nl"/>
+        </w:rPr>
+        <w:t xml:space="preserve">/robots.txt</w:t>
+      </w:r>
+      <w:r>
+        <w:rPr>
+          <w:lang w:val="nl"/>
+        </w:rPr>
+        <w:t xml:space="preserve"> </w:t>
+      </w:r>
+      <w:r>
+        <w:rPr>
+          <w:lang w:val="nl"/>
+        </w:rPr>
+        <w:t xml:space="preserve">verwijst daarnaar.</w:t>
+      </w:r>
+      <w:r>
+        <w:rPr>
+          <w:lang w:val="nl"/>
+        </w:rPr>
+        <w:t xml:space="preserve"> </w:t>
+      </w:r>
+      <w:r>
+        <w:rPr>
+          <w:lang w:val="nl"/>
+        </w:rPr>
+        <w:t xml:space="preserve">Meld de sitemap één keer aan in Google Search Console.</w:t>
       </w:r>
     </w:p>
     <w:p>
@@ -4060,27 +4107,124 @@
         <w:rPr>
           <w:lang w:val="nl"/>
         </w:rPr>
-        <w:t xml:space="preserve">Daaronder staat</w:t>
-      </w:r>
-      <w:r>
-        <w:rPr>
-          <w:lang w:val="nl"/>
-        </w:rPr>
-        <w:t xml:space="preserve"> </w:t>
-      </w:r>
-      <w:r>
-        <w:rPr>
-          <w:b/>
-          <w:bCs/>
-          <w:lang w:val="nl"/>
-        </w:rPr>
-        <w:t xml:space="preserve">Waar haken mensen af?</w:t>
-      </w:r>
-      <w:r>
-        <w:rPr>
-          <w:lang w:val="nl"/>
-        </w:rPr>
-        <w:t xml:space="preserve">. Die trechter heeft deze treden:</w:t>
+        <w:t xml:space="preserve">Op de testomgeving is een pagina nooit vindbaar, ook niet met het vinkje aan: anders concurreert</w:t>
+      </w:r>
+      <w:r>
+        <w:rPr>
+          <w:lang w:val="nl"/>
+        </w:rPr>
+        <w:t xml:space="preserve"> </w:t>
+      </w:r>
+      <w:r>
+        <w:rPr>
+          <w:lang w:val="nl"/>
+        </w:rPr>
+        <w:t xml:space="preserve">test met de echte site in de zoekresultaten.</w:t>
+      </w:r>
+    </w:p>
+    <w:p>
+      <w:pPr>
+        <w:pStyle w:val="BodyText"/>
+      </w:pPr>
+      <w:r>
+        <w:rPr>
+          <w:lang w:val="nl"/>
+        </w:rPr>
+        <w:t xml:space="preserve">In het overzicht staat</w:t>
+      </w:r>
+      <w:r>
+        <w:rPr>
+          <w:lang w:val="nl"/>
+        </w:rPr>
+        <w:t xml:space="preserve"> </w:t>
+      </w:r>
+      <w:r>
+        <w:rPr>
+          <w:b/>
+          <w:bCs/>
+          <w:lang w:val="nl"/>
+        </w:rPr>
+        <w:t xml:space="preserve">Geen ontwerp</w:t>
+      </w:r>
+      <w:r>
+        <w:rPr>
+          <w:lang w:val="nl"/>
+        </w:rPr>
+        <w:t xml:space="preserve"> </w:t>
+      </w:r>
+      <w:r>
+        <w:rPr>
+          <w:lang w:val="nl"/>
+        </w:rPr>
+        <w:t xml:space="preserve">bij een pagina waarop nog geen versie live staat.</w:t>
+      </w:r>
+    </w:p>
+    <w:p>
+      <w:r>
+        <w:pict>
+          <v:rect style="width:0;height:1.5pt" o:hralign="center" o:hrstd="t" o:hr="t"/>
+        </w:pict>
+      </w:r>
+    </w:p>
+    <w:bookmarkEnd w:id="17"/>
+    <w:bookmarkStart w:id="18" w:name="cijfers-waar-haken-mensen-af"/>
+    <w:p>
+      <w:pPr>
+        <w:pStyle w:val="Heading1"/>
+      </w:pPr>
+      <w:r>
+        <w:rPr>
+          <w:lang w:val="nl"/>
+        </w:rPr>
+        <w:t xml:space="preserve">Cijfers: waar haken mensen af?</w:t>
+      </w:r>
+    </w:p>
+    <w:p>
+      <w:pPr>
+        <w:pStyle w:val="BlockText"/>
+      </w:pPr>
+      <w:r>
+        <w:rPr>
+          <w:b/>
+          <w:bCs/>
+          <w:lang w:val="nl"/>
+        </w:rPr>
+        <w:t xml:space="preserve">In het kort:</w:t>
+      </w:r>
+      <w:r>
+        <w:rPr>
+          <w:lang w:val="nl"/>
+        </w:rPr>
+        <w:t xml:space="preserve"> </w:t>
+      </w:r>
+      <w:r>
+        <w:rPr>
+          <w:lang w:val="nl"/>
+        </w:rPr>
+        <w:t xml:space="preserve">per pagina zie je bezoekers, bezoeken, aanmeldingen en omzetting, en een</w:t>
+      </w:r>
+      <w:r>
+        <w:rPr>
+          <w:lang w:val="nl"/>
+        </w:rPr>
+        <w:t xml:space="preserve"> </w:t>
+      </w:r>
+      <w:r>
+        <w:rPr>
+          <w:lang w:val="nl"/>
+        </w:rPr>
+        <w:t xml:space="preserve">trechter die laat zien bij welke stap van het formulier mensen stoppen.</w:t>
+      </w:r>
+    </w:p>
+    <w:p>
+      <w:pPr>
+        <w:pStyle w:val="FirstParagraph"/>
+      </w:pPr>
+      <w:r>
+        <w:rPr>
+          <w:lang w:val="nl"/>
+        </w:rPr>
+        <w:t xml:space="preserve">Bovenaan een pagina, en per pagina in het overzicht, staan vier cijfers:</w:t>
       </w:r>
     </w:p>
     <w:p>
@@ -4093,9 +4237,61 @@
       </w:pPr>
       <w:r>
         <w:rPr>
-          <w:lang w:val="nl"/>
-        </w:rPr>
-        <w:t xml:space="preserve">Pagina bekeken</w:t>
+          <w:b/>
+          <w:bCs/>
+          <w:lang w:val="nl"/>
+        </w:rPr>
+        <w:t xml:space="preserve">Unieke bezoekers</w:t>
+      </w:r>
+      <w:r>
+        <w:rPr>
+          <w:lang w:val="nl"/>
+        </w:rPr>
+        <w:t xml:space="preserve"> </w:t>
+      </w:r>
+      <w:r>
+        <w:rPr>
+          <w:lang w:val="nl"/>
+        </w:rPr>
+        <w:t xml:space="preserve">en</w:t>
+      </w:r>
+      <w:r>
+        <w:rPr>
+          <w:lang w:val="nl"/>
+        </w:rPr>
+        <w:t xml:space="preserve"> </w:t>
+      </w:r>
+      <w:r>
+        <w:rPr>
+          <w:b/>
+          <w:bCs/>
+          <w:lang w:val="nl"/>
+        </w:rPr>
+        <w:t xml:space="preserve">Bezoeken</w:t>
+      </w:r>
+      <w:r>
+        <w:rPr>
+          <w:lang w:val="nl"/>
+        </w:rPr>
+        <w:t xml:space="preserve"> </w:t>
+      </w:r>
+      <w:r>
+        <w:rPr>
+          <w:lang w:val="nl"/>
+        </w:rPr>
+        <w:t xml:space="preserve">(dezelfde bezoeker telt hooguit eens per 30 minuten als</w:t>
+      </w:r>
+      <w:r>
+        <w:rPr>
+          <w:lang w:val="nl"/>
+        </w:rPr>
+        <w:t xml:space="preserve"> </w:t>
+      </w:r>
+      <w:r>
+        <w:rPr>
+          <w:lang w:val="nl"/>
+        </w:rPr>
+        <w:t xml:space="preserve">bezoek);</w:t>
       </w:r>
     </w:p>
     <w:p>
@@ -4108,9 +4304,17 @@
       </w:pPr>
       <w:r>
         <w:rPr>
-          <w:lang w:val="nl"/>
-        </w:rPr>
-        <w:t xml:space="preserve">Stap 1 · Naam (begonnen met invullen)</w:t>
+          <w:b/>
+          <w:bCs/>
+          <w:lang w:val="nl"/>
+        </w:rPr>
+        <w:t xml:space="preserve">Aanmeldingen</w:t>
+      </w:r>
+      <w:r>
+        <w:rPr>
+          <w:lang w:val="nl"/>
+        </w:rPr>
+        <w:t xml:space="preserve">: verstuurde formulieren;</w:t>
       </w:r>
     </w:p>
     <w:p>
@@ -4123,39 +4327,17 @@
       </w:pPr>
       <w:r>
         <w:rPr>
-          <w:lang w:val="nl"/>
-        </w:rPr>
-        <w:t xml:space="preserve">Stap 2 · Jij</w:t>
-      </w:r>
-    </w:p>
-    <w:p>
-      <w:pPr>
-        <w:pStyle w:val="Compact"/>
-        <w:numPr>
-          <w:ilvl w:val="0"/>
-          <w:numId w:val="1006"/>
-        </w:numPr>
-      </w:pPr>
-      <w:r>
-        <w:rPr>
-          <w:lang w:val="nl"/>
-        </w:rPr>
-        <w:t xml:space="preserve">Stap 3 · Contact</w:t>
-      </w:r>
-    </w:p>
-    <w:p>
-      <w:pPr>
-        <w:pStyle w:val="Compact"/>
-        <w:numPr>
-          <w:ilvl w:val="0"/>
-          <w:numId w:val="1006"/>
-        </w:numPr>
-      </w:pPr>
-      <w:r>
-        <w:rPr>
-          <w:lang w:val="nl"/>
-        </w:rPr>
-        <w:t xml:space="preserve">Aanmelding verstuurd</w:t>
+          <w:b/>
+          <w:bCs/>
+          <w:lang w:val="nl"/>
+        </w:rPr>
+        <w:t xml:space="preserve">Omzetting</w:t>
+      </w:r>
+      <w:r>
+        <w:rPr>
+          <w:lang w:val="nl"/>
+        </w:rPr>
+        <w:t xml:space="preserve">: aanmeldingen gedeeld door unieke bezoekers.</w:t>
       </w:r>
     </w:p>
     <w:p>
@@ -4166,1153 +4348,27 @@
         <w:rPr>
           <w:lang w:val="nl"/>
         </w:rPr>
-        <w:t xml:space="preserve">Bij elke trede staat het aantal en het percentage van iedereen die aan het formulier begon. Waar</w:t>
-      </w:r>
-      <w:r>
-        <w:rPr>
-          <w:lang w:val="nl"/>
-        </w:rPr>
-        <w:t xml:space="preserve"> </w:t>
-      </w:r>
-      <w:r>
-        <w:rPr>
-          <w:lang w:val="nl"/>
-        </w:rPr>
-        <w:t xml:space="preserve">mensen afvallen, staat "… gingen hier niet verder".</w:t>
-      </w:r>
-    </w:p>
-    <w:p>
-      <w:pPr>
-        <w:pStyle w:val="BodyText"/>
-      </w:pPr>
-      <w:r>
-        <w:rPr>
-          <w:lang w:val="nl"/>
-        </w:rPr>
-        <w:t xml:space="preserve">Los daaronder staat</w:t>
-      </w:r>
-      <w:r>
-        <w:rPr>
-          <w:lang w:val="nl"/>
-        </w:rPr>
-        <w:t xml:space="preserve"> </w:t>
-      </w:r>
-      <w:r>
-        <w:rPr>
-          <w:b/>
-          <w:bCs/>
-          <w:lang w:val="nl"/>
-        </w:rPr>
-        <w:t xml:space="preserve">Halverwege weggegaan</w:t>
-      </w:r>
-      <w:r>
-        <w:rPr>
-          <w:lang w:val="nl"/>
-        </w:rPr>
-        <w:t xml:space="preserve">, per stap. Dat is geen telling maar een aanwijzing.</w:t>
-      </w:r>
-      <w:r>
-        <w:rPr>
-          <w:lang w:val="nl"/>
-        </w:rPr>
-        <w:t xml:space="preserve"> </w:t>
-      </w:r>
-      <w:r>
-        <w:rPr>
-          <w:lang w:val="nl"/>
-        </w:rPr>
-        <w:t xml:space="preserve">Het signaal komt van een tabblad dat naar de achtergrond gaat, en dat gebeurt ook als iemand even</w:t>
-      </w:r>
-      <w:r>
-        <w:rPr>
-          <w:lang w:val="nl"/>
-        </w:rPr>
-        <w:t xml:space="preserve"> </w:t>
-      </w:r>
-      <w:r>
-        <w:rPr>
-          <w:lang w:val="nl"/>
-        </w:rPr>
-        <w:t xml:space="preserve">iets opzoekt en daarna gewoon doorgaat. Gebruik het om te zien bij welke stap het vaakst gebeurt,</w:t>
-      </w:r>
-      <w:r>
-        <w:rPr>
-          <w:lang w:val="nl"/>
-        </w:rPr>
-        <w:t xml:space="preserve"> </w:t>
-      </w:r>
-      <w:r>
-        <w:rPr>
-          <w:lang w:val="nl"/>
-        </w:rPr>
-        <w:t xml:space="preserve">niet als aantal afhakers.</w:t>
-      </w:r>
-    </w:p>
-    <w:p>
-      <w:pPr>
-        <w:pStyle w:val="BodyText"/>
-      </w:pPr>
-      <w:r>
-        <w:rPr>
-          <w:lang w:val="nl"/>
-        </w:rPr>
-        <w:t xml:space="preserve">Is er nog niets gemeten, dan staat er dat de cijfers verschijnen zodra de pagina gepubliceerd is</w:t>
-      </w:r>
-      <w:r>
-        <w:rPr>
-          <w:lang w:val="nl"/>
-        </w:rPr>
-        <w:t xml:space="preserve"> </w:t>
-      </w:r>
-      <w:r>
-        <w:rPr>
-          <w:lang w:val="nl"/>
-        </w:rPr>
-        <w:t xml:space="preserve">en er bezoekers komen.</w:t>
-      </w:r>
-    </w:p>
-    <w:p>
-      <w:r>
-        <w:pict>
-          <v:rect style="width:0;height:1.5pt" o:hralign="center" o:hrstd="t" o:hr="t"/>
-        </w:pict>
-      </w:r>
-    </w:p>
-    <w:bookmarkEnd w:id="18"/>
-    <w:bookmarkStart w:id="19" w:name="herkomst-bijhouden"/>
-    <w:p>
-      <w:pPr>
-        <w:pStyle w:val="Heading1"/>
-      </w:pPr>
-      <w:r>
-        <w:rPr>
-          <w:lang w:val="nl"/>
-        </w:rPr>
-        <w:t xml:space="preserve">Herkomst bijhouden</w:t>
-      </w:r>
-    </w:p>
-    <w:p>
-      <w:pPr>
-        <w:pStyle w:val="BlockText"/>
-      </w:pPr>
-      <w:r>
-        <w:rPr>
-          <w:b/>
-          <w:bCs/>
-          <w:lang w:val="nl"/>
-        </w:rPr>
-        <w:t xml:space="preserve">In het kort:</w:t>
-      </w:r>
-      <w:r>
-        <w:rPr>
-          <w:lang w:val="nl"/>
-        </w:rPr>
-        <w:t xml:space="preserve"> </w:t>
-      </w:r>
-      <w:r>
-        <w:rPr>
-          <w:lang w:val="nl"/>
-        </w:rPr>
-        <w:t xml:space="preserve">elke pagina heeft een bron-code die meereist tot in het dossier van de</w:t>
-      </w:r>
-      <w:r>
-        <w:rPr>
-          <w:lang w:val="nl"/>
-        </w:rPr>
-        <w:t xml:space="preserve"> </w:t>
-      </w:r>
-      <w:r>
-        <w:rPr>
-          <w:lang w:val="nl"/>
-        </w:rPr>
-        <w:t xml:space="preserve">sollicitant. Onderaan het overzicht zie je per bron hoeveel aanmeldingen er kwamen en hoeveel</w:t>
-      </w:r>
-      <w:r>
-        <w:rPr>
-          <w:lang w:val="nl"/>
-        </w:rPr>
-        <w:t xml:space="preserve"> </w:t>
-      </w:r>
-      <w:r>
-        <w:rPr>
-          <w:lang w:val="nl"/>
-        </w:rPr>
-        <w:t xml:space="preserve">daarvan zijn aangenomen.</w:t>
-      </w:r>
-    </w:p>
-    <w:p>
-      <w:pPr>
-        <w:pStyle w:val="FirstParagraph"/>
-      </w:pPr>
-      <w:r>
-        <w:rPr>
-          <w:lang w:val="nl"/>
-        </w:rPr>
-        <w:t xml:space="preserve">Elke pagina heeft een</w:t>
-      </w:r>
-      <w:r>
-        <w:rPr>
-          <w:lang w:val="nl"/>
-        </w:rPr>
-        <w:t xml:space="preserve"> </w:t>
-      </w:r>
-      <w:r>
-        <w:rPr>
-          <w:b/>
-          <w:bCs/>
-          <w:lang w:val="nl"/>
-        </w:rPr>
-        <w:t xml:space="preserve">bron-code</w:t>
-      </w:r>
-      <w:r>
-        <w:rPr>
-          <w:lang w:val="nl"/>
-        </w:rPr>
-        <w:t xml:space="preserve">. Je stelt hem in bij "Gegevens"; laat je het veld leeg, dan</w:t>
-      </w:r>
-      <w:r>
-        <w:rPr>
-          <w:lang w:val="nl"/>
-        </w:rPr>
-        <w:t xml:space="preserve"> </w:t>
-      </w:r>
-      <w:r>
-        <w:rPr>
-          <w:lang w:val="nl"/>
-        </w:rPr>
-        <w:t xml:space="preserve">wordt het adres van de pagina gebruikt. De code reist mee tot in het dossier van de sollicitant,</w:t>
-      </w:r>
-      <w:r>
-        <w:rPr>
-          <w:lang w:val="nl"/>
-        </w:rPr>
-        <w:t xml:space="preserve"> </w:t>
-      </w:r>
-      <w:r>
-        <w:rPr>
-          <w:lang w:val="nl"/>
-        </w:rPr>
-        <w:t xml:space="preserve">dus je ziet later precies welke pagina welke aanmeldingen heeft opgeleverd, en hoeveel daarvan</w:t>
-      </w:r>
-      <w:r>
-        <w:rPr>
-          <w:lang w:val="nl"/>
-        </w:rPr>
-        <w:t xml:space="preserve"> </w:t>
-      </w:r>
-      <w:r>
-        <w:rPr>
-          <w:lang w:val="nl"/>
-        </w:rPr>
-        <w:t xml:space="preserve">uiteindelijk zijn aangenomen.</w:t>
-      </w:r>
-    </w:p>
-    <w:p>
-      <w:pPr>
-        <w:pStyle w:val="BodyText"/>
-      </w:pPr>
-      <w:r>
-        <w:rPr>
-          <w:lang w:val="nl"/>
-        </w:rPr>
-        <w:t xml:space="preserve">Dat overzicht staat onderaan het overzicht van wervingspagina's, onder</w:t>
-      </w:r>
-      <w:r>
-        <w:rPr>
-          <w:lang w:val="nl"/>
-        </w:rPr>
-        <w:t xml:space="preserve"> </w:t>
-      </w:r>
-      <w:r>
-        <w:rPr>
-          <w:b/>
-          <w:bCs/>
-          <w:lang w:val="nl"/>
-        </w:rPr>
-        <w:t xml:space="preserve">Waar komen aanmeldingen</w:t>
-      </w:r>
-      <w:r>
-        <w:rPr>
-          <w:b/>
-          <w:bCs/>
-          <w:lang w:val="nl"/>
-        </w:rPr>
-        <w:t xml:space="preserve"> </w:t>
-      </w:r>
-      <w:r>
-        <w:rPr>
-          <w:b/>
-          <w:bCs/>
-          <w:lang w:val="nl"/>
-        </w:rPr>
-        <w:t xml:space="preserve">vandaan?</w:t>
-      </w:r>
-      <w:r>
-        <w:rPr>
-          <w:lang w:val="nl"/>
-        </w:rPr>
-        <w:t xml:space="preserve">: per bron het aantal aanmeldingen, het aantal aangenomen en het aandeel.</w:t>
-      </w:r>
-    </w:p>
-    <w:p>
-      <w:pPr>
-        <w:pStyle w:val="BodyText"/>
-      </w:pPr>
-      <w:r>
-        <w:rPr>
-          <w:lang w:val="nl"/>
-        </w:rPr>
-        <w:t xml:space="preserve">Gebruik je het gewone aanmeldformulier voor meerdere advertenties, dan kun je de bron ook in het</w:t>
-      </w:r>
-      <w:r>
-        <w:rPr>
-          <w:lang w:val="nl"/>
-        </w:rPr>
-        <w:t xml:space="preserve"> </w:t>
-      </w:r>
-      <w:r>
-        <w:rPr>
-          <w:lang w:val="nl"/>
-        </w:rPr>
-        <w:t xml:space="preserve">adres meegeven:</w:t>
-      </w:r>
-      <w:r>
-        <w:rPr>
-          <w:lang w:val="nl"/>
-        </w:rPr>
-        <w:t xml:space="preserve"> </w:t>
-      </w:r>
-      <w:r>
-        <w:rPr>
-          <w:rStyle w:val="VerbatimChar"/>
-          <w:lang w:val="nl"/>
-        </w:rPr>
-        <w:t xml:space="preserve">https://sollicitatie.paal13.com/aanmelden.php?bron=instagram-mei</w:t>
-      </w:r>
-      <w:r>
-        <w:rPr>
-          <w:lang w:val="nl"/>
-        </w:rPr>
-        <w:t xml:space="preserve">.</w:t>
-      </w:r>
-    </w:p>
-    <w:p>
-      <w:pPr>
-        <w:pStyle w:val="BodyText"/>
-      </w:pPr>
-      <w:r>
-        <w:rPr>
-          <w:lang w:val="nl"/>
-        </w:rPr>
-        <w:t xml:space="preserve">Het veld</w:t>
-      </w:r>
-      <w:r>
-        <w:rPr>
-          <w:lang w:val="nl"/>
-        </w:rPr>
-        <w:t xml:space="preserve"> </w:t>
-      </w:r>
-      <w:r>
-        <w:rPr>
-          <w:b/>
-          <w:bCs/>
-          <w:lang w:val="nl"/>
-        </w:rPr>
-        <w:t xml:space="preserve">Doelgroep</w:t>
-      </w:r>
-      <w:r>
-        <w:rPr>
-          <w:lang w:val="nl"/>
-        </w:rPr>
-        <w:t xml:space="preserve"> </w:t>
-      </w:r>
-      <w:r>
-        <w:rPr>
-          <w:lang w:val="nl"/>
-        </w:rPr>
-        <w:t xml:space="preserve">bij "Gegevens" is alleen voor jezelf; het staat in het overzicht achter het</w:t>
-      </w:r>
-      <w:r>
-        <w:rPr>
-          <w:lang w:val="nl"/>
-        </w:rPr>
-        <w:t xml:space="preserve"> </w:t>
-      </w:r>
-      <w:r>
-        <w:rPr>
-          <w:lang w:val="nl"/>
-        </w:rPr>
-        <w:t xml:space="preserve">adres.</w:t>
-      </w:r>
-    </w:p>
-    <w:p>
-      <w:r>
-        <w:pict>
-          <v:rect style="width:0;height:1.5pt" o:hralign="center" o:hrstd="t" o:hr="t"/>
-        </w:pict>
-      </w:r>
-    </w:p>
-    <w:bookmarkEnd w:id="19"/>
-    <w:bookmarkStart w:id="20" w:name="wat-we-van-bezoekers-bijhouden"/>
-    <w:p>
-      <w:pPr>
-        <w:pStyle w:val="Heading1"/>
-      </w:pPr>
-      <w:r>
-        <w:rPr>
-          <w:lang w:val="nl"/>
-        </w:rPr>
-        <w:t xml:space="preserve">Wat we van bezoekers bijhouden</w:t>
-      </w:r>
-    </w:p>
-    <w:p>
-      <w:pPr>
-        <w:pStyle w:val="BlockText"/>
-      </w:pPr>
-      <w:r>
-        <w:rPr>
-          <w:b/>
-          <w:bCs/>
-          <w:lang w:val="nl"/>
-        </w:rPr>
-        <w:t xml:space="preserve">In het kort:</w:t>
-      </w:r>
-      <w:r>
-        <w:rPr>
-          <w:lang w:val="nl"/>
-        </w:rPr>
-        <w:t xml:space="preserve"> </w:t>
-      </w:r>
-      <w:r>
-        <w:rPr>
-          <w:lang w:val="nl"/>
-        </w:rPr>
-        <w:t xml:space="preserve">zo min mogelijk. Geen cookies, geen sessie, geen cookiemelding nodig. Alleen</w:t>
-      </w:r>
-      <w:r>
-        <w:rPr>
-          <w:lang w:val="nl"/>
-        </w:rPr>
-        <w:t xml:space="preserve"> </w:t>
-      </w:r>
-      <w:r>
-        <w:rPr>
-          <w:lang w:val="nl"/>
-        </w:rPr>
-        <w:t xml:space="preserve">tellingen, met een code die elke dag verandert.</w:t>
-      </w:r>
-    </w:p>
-    <w:p>
-      <w:pPr>
-        <w:pStyle w:val="FirstParagraph"/>
-      </w:pPr>
-      <w:r>
-        <w:rPr>
-          <w:lang w:val="nl"/>
-        </w:rPr>
-        <w:t xml:space="preserve">De pagina zet</w:t>
-      </w:r>
-      <w:r>
-        <w:rPr>
-          <w:lang w:val="nl"/>
-        </w:rPr>
-        <w:t xml:space="preserve"> </w:t>
-      </w:r>
-      <w:r>
-        <w:rPr>
-          <w:b/>
-          <w:bCs/>
-          <w:lang w:val="nl"/>
-        </w:rPr>
-        <w:t xml:space="preserve">geen cookies</w:t>
-      </w:r>
-      <w:r>
-        <w:rPr>
-          <w:lang w:val="nl"/>
-        </w:rPr>
-        <w:t xml:space="preserve"> </w:t>
-      </w:r>
-      <w:r>
-        <w:rPr>
-          <w:lang w:val="nl"/>
-        </w:rPr>
-        <w:t xml:space="preserve">en start geen sessie, dus er is geen cookiemelding nodig.</w:t>
-      </w:r>
-    </w:p>
-    <w:p>
-      <w:pPr>
-        <w:pStyle w:val="BodyText"/>
-      </w:pPr>
-      <w:r>
-        <w:rPr>
-          <w:lang w:val="nl"/>
-        </w:rPr>
-        <w:t xml:space="preserve">Om unieke bezoekers te kunnen tellen wordt een versleutelde code bewaard die elke dag</w:t>
-      </w:r>
-      <w:r>
-        <w:rPr>
-          <w:lang w:val="nl"/>
-        </w:rPr>
-        <w:t xml:space="preserve"> </w:t>
-      </w:r>
-      <w:r>
-        <w:rPr>
-          <w:lang w:val="nl"/>
-        </w:rPr>
-        <w:t xml:space="preserve">verandert en niet naar een persoon te herleiden is. Die code wordt na 30 dagen gewist; de</w:t>
-      </w:r>
-      <w:r>
-        <w:rPr>
-          <w:lang w:val="nl"/>
-        </w:rPr>
-        <w:t xml:space="preserve"> </w:t>
-      </w:r>
-      <w:r>
-        <w:rPr>
-          <w:lang w:val="nl"/>
-        </w:rPr>
-        <w:t xml:space="preserve">aantallen blijven. De cijfers zelf verdwijnen na 13 maanden. Beide termijnen staan bij</w:t>
-      </w:r>
-      <w:r>
-        <w:rPr>
-          <w:lang w:val="nl"/>
-        </w:rPr>
-        <w:t xml:space="preserve"> </w:t>
-      </w:r>
-      <w:r>
-        <w:rPr>
-          <w:b/>
-          <w:bCs/>
-          <w:lang w:val="nl"/>
-        </w:rPr>
-        <w:t xml:space="preserve">Instellingen › Bewaren &amp; opschonen</w:t>
-      </w:r>
-      <w:r>
-        <w:rPr>
-          <w:lang w:val="nl"/>
-        </w:rPr>
-        <w:t xml:space="preserve"> </w:t>
-      </w:r>
-      <w:r>
-        <w:rPr>
-          <w:lang w:val="nl"/>
-        </w:rPr>
-        <w:t xml:space="preserve">("Herkenning unieke bezoekers" en "Bezoekersstatistiek</w:t>
-      </w:r>
-      <w:r>
-        <w:rPr>
-          <w:lang w:val="nl"/>
-        </w:rPr>
-        <w:t xml:space="preserve"> </w:t>
-      </w:r>
-      <w:r>
-        <w:rPr>
-          <w:lang w:val="nl"/>
-        </w:rPr>
-        <w:t xml:space="preserve">wervingspagina's"). Het wissen gebeurt alleen als daar "Automatisch opschonen inschakelen" aan</w:t>
-      </w:r>
-      <w:r>
-        <w:rPr>
-          <w:lang w:val="nl"/>
-        </w:rPr>
-        <w:t xml:space="preserve"> </w:t>
-      </w:r>
-      <w:r>
-        <w:rPr>
-          <w:lang w:val="nl"/>
-        </w:rPr>
-        <w:t xml:space="preserve">staat.</w:t>
-      </w:r>
-    </w:p>
-    <w:p>
-      <w:pPr>
-        <w:pStyle w:val="BodyText"/>
-      </w:pPr>
-      <w:r>
-        <w:rPr>
-          <w:lang w:val="nl"/>
-        </w:rPr>
-        <w:t xml:space="preserve">Dezelfde bezoeker telt hooguit</w:t>
-      </w:r>
-      <w:r>
-        <w:rPr>
-          <w:lang w:val="nl"/>
-        </w:rPr>
-        <w:t xml:space="preserve"> </w:t>
-      </w:r>
-      <w:r>
-        <w:rPr>
-          <w:b/>
-          <w:bCs/>
-          <w:lang w:val="nl"/>
-        </w:rPr>
-        <w:t xml:space="preserve">eens per 30 minuten</w:t>
-      </w:r>
-      <w:r>
-        <w:rPr>
-          <w:lang w:val="nl"/>
-        </w:rPr>
-        <w:t xml:space="preserve"> </w:t>
-      </w:r>
-      <w:r>
-        <w:rPr>
-          <w:lang w:val="nl"/>
-        </w:rPr>
-        <w:t xml:space="preserve">als bezoek op dezelfde pagina.</w:t>
-      </w:r>
-      <w:r>
-        <w:rPr>
-          <w:lang w:val="nl"/>
-        </w:rPr>
-        <w:t xml:space="preserve"> </w:t>
-      </w:r>
-      <w:r>
-        <w:rPr>
-          <w:lang w:val="nl"/>
-        </w:rPr>
-        <w:t xml:space="preserve">Vernieuwen, de terug-knop en een tabblad dat door de browser in de slaapstand is gezet en</w:t>
-      </w:r>
-      <w:r>
-        <w:rPr>
-          <w:lang w:val="nl"/>
-        </w:rPr>
-        <w:t xml:space="preserve"> </w:t>
-      </w:r>
-      <w:r>
-        <w:rPr>
-          <w:lang w:val="nl"/>
-        </w:rPr>
-        <w:t xml:space="preserve">daarna opnieuw laadt, tellen dus niet opnieuw mee. Bekende zoekmachines en andere robots tellen</w:t>
-      </w:r>
-      <w:r>
-        <w:rPr>
-          <w:lang w:val="nl"/>
-        </w:rPr>
-        <w:t xml:space="preserve"> </w:t>
-      </w:r>
-      <w:r>
-        <w:rPr>
-          <w:lang w:val="nl"/>
-        </w:rPr>
-        <w:t xml:space="preserve">niet mee.</w:t>
-      </w:r>
-    </w:p>
-    <w:p>
-      <w:pPr>
-        <w:pStyle w:val="BodyText"/>
-      </w:pPr>
-      <w:r>
-        <w:rPr>
-          <w:lang w:val="nl"/>
-        </w:rPr>
-        <w:t xml:space="preserve">Naast het bezoek houden we bij hoever iemand in het formulier kwam: begonnen met invullen,</w:t>
-      </w:r>
-      <w:r>
-        <w:rPr>
-          <w:lang w:val="nl"/>
-        </w:rPr>
-        <w:t xml:space="preserve"> </w:t>
-      </w:r>
-      <w:r>
-        <w:rPr>
-          <w:lang w:val="nl"/>
-        </w:rPr>
-        <w:t xml:space="preserve">stap 2 bereikt, stap 3 bereikt, verstuurd. Daarvan staat alleen het stapnummer geregistreerd,</w:t>
-      </w:r>
-      <w:r>
-        <w:rPr>
-          <w:lang w:val="nl"/>
-        </w:rPr>
-        <w:t xml:space="preserve"> </w:t>
-      </w:r>
-      <w:r>
-        <w:rPr>
-          <w:lang w:val="nl"/>
-        </w:rPr>
-        <w:t xml:space="preserve">nooit iets wat iemand heeft ingetypt.</w:t>
-      </w:r>
-    </w:p>
-    <w:p>
-      <w:pPr>
-        <w:pStyle w:val="BodyText"/>
-      </w:pPr>
-      <w:r>
-        <w:rPr>
-          <w:lang w:val="nl"/>
-        </w:rPr>
-        <w:t xml:space="preserve">Wil je helemaal niets meten, zet dan onder</w:t>
-      </w:r>
-      <w:r>
-        <w:rPr>
-          <w:lang w:val="nl"/>
-        </w:rPr>
-        <w:t xml:space="preserve"> </w:t>
-      </w:r>
-      <w:r>
-        <w:rPr>
-          <w:b/>
-          <w:bCs/>
-          <w:lang w:val="nl"/>
-        </w:rPr>
-        <w:t xml:space="preserve">Instellingen › Bewaren &amp; opschonen</w:t>
-      </w:r>
-      <w:r>
-        <w:rPr>
-          <w:lang w:val="nl"/>
-        </w:rPr>
-        <w:t xml:space="preserve"> </w:t>
-      </w:r>
-      <w:r>
-        <w:rPr>
-          <w:lang w:val="nl"/>
-        </w:rPr>
-        <w:t xml:space="preserve">het vinkje</w:t>
-      </w:r>
-      <w:r>
-        <w:rPr>
-          <w:lang w:val="nl"/>
-        </w:rPr>
-        <w:t xml:space="preserve"> </w:t>
-      </w:r>
-      <w:r>
-        <w:rPr>
-          <w:b/>
-          <w:bCs/>
-          <w:lang w:val="nl"/>
-        </w:rPr>
-        <w:t xml:space="preserve">Bezoekersstatistiek op de wervingspagina's en het aanmeldformulier</w:t>
-      </w:r>
-      <w:r>
-        <w:rPr>
-          <w:lang w:val="nl"/>
-        </w:rPr>
-        <w:t xml:space="preserve"> </w:t>
-      </w:r>
-      <w:r>
-        <w:rPr>
-          <w:lang w:val="nl"/>
-        </w:rPr>
-        <w:t xml:space="preserve">uit (standaard staat het</w:t>
-      </w:r>
-      <w:r>
-        <w:rPr>
-          <w:lang w:val="nl"/>
-        </w:rPr>
-        <w:t xml:space="preserve"> </w:t>
-      </w:r>
-      <w:r>
-        <w:rPr>
-          <w:lang w:val="nl"/>
-        </w:rPr>
-        <w:t xml:space="preserve">aan). Dan schrijft het systeem geen enkele gebeurtenis meer weg en verdwijnt ook het meetadres uit</w:t>
-      </w:r>
-      <w:r>
-        <w:rPr>
-          <w:lang w:val="nl"/>
-        </w:rPr>
-        <w:t xml:space="preserve"> </w:t>
-      </w:r>
-      <w:r>
-        <w:rPr>
-          <w:lang w:val="nl"/>
-        </w:rPr>
-        <w:t xml:space="preserve">de pagina. Wat al geteld is, blijft staan volgens de termijnen hierboven.</w:t>
-      </w:r>
-    </w:p>
-    <w:p>
-      <w:pPr>
-        <w:pStyle w:val="BodyText"/>
-      </w:pPr>
-      <w:r>
-        <w:rPr>
-          <w:lang w:val="nl"/>
-        </w:rPr>
-        <w:t xml:space="preserve">Let op: zet je ontwerp zelf een cookie of een tracker, dan gelden de gewone regels wél en is</w:t>
-      </w:r>
-      <w:r>
-        <w:rPr>
-          <w:lang w:val="nl"/>
-        </w:rPr>
-        <w:t xml:space="preserve"> </w:t>
-      </w:r>
-      <w:r>
-        <w:rPr>
-          <w:lang w:val="nl"/>
-        </w:rPr>
-        <w:t xml:space="preserve">de brigade daarvoor verantwoordelijk. Het rapport waarschuwt daarvoor, en de browser</w:t>
-      </w:r>
-      <w:r>
-        <w:rPr>
-          <w:lang w:val="nl"/>
-        </w:rPr>
-        <w:t xml:space="preserve"> </w:t>
-      </w:r>
-      <w:r>
-        <w:rPr>
-          <w:lang w:val="nl"/>
-        </w:rPr>
-        <w:t xml:space="preserve">blokkeert het tot je het toestaat.</w:t>
-      </w:r>
-    </w:p>
-    <w:p>
-      <w:r>
-        <w:pict>
-          <v:rect style="width:0;height:1.5pt" o:hralign="center" o:hrstd="t" o:hr="t"/>
-        </w:pict>
-      </w:r>
-    </w:p>
-    <w:bookmarkEnd w:id="20"/>
-    <w:bookmarkStart w:id="21" w:name="het-adres-wijzigen"/>
-    <w:p>
-      <w:pPr>
-        <w:pStyle w:val="Heading1"/>
-      </w:pPr>
-      <w:r>
-        <w:rPr>
-          <w:lang w:val="nl"/>
-        </w:rPr>
-        <w:t xml:space="preserve">Het adres wijzigen</w:t>
-      </w:r>
-    </w:p>
-    <w:p>
-      <w:pPr>
-        <w:pStyle w:val="BlockText"/>
-      </w:pPr>
-      <w:r>
-        <w:rPr>
-          <w:b/>
-          <w:bCs/>
-          <w:lang w:val="nl"/>
-        </w:rPr>
-        <w:t xml:space="preserve">In het kort:</w:t>
-      </w:r>
-      <w:r>
-        <w:rPr>
-          <w:lang w:val="nl"/>
-        </w:rPr>
-        <w:t xml:space="preserve"> </w:t>
-      </w:r>
-      <w:r>
-        <w:rPr>
-          <w:lang w:val="nl"/>
-        </w:rPr>
-        <w:t xml:space="preserve">kan, maar bestaande links, QR-codes en advertenties werken daarna niet meer.</w:t>
-      </w:r>
-    </w:p>
-    <w:p>
-      <w:pPr>
-        <w:pStyle w:val="FirstParagraph"/>
-      </w:pPr>
-      <w:r>
-        <w:rPr>
-          <w:lang w:val="nl"/>
-        </w:rPr>
-        <w:t xml:space="preserve">Wijzig je bij "Gegevens" het adres van een pagina, dan verhuizen de afbeeldingen automatisch mee,</w:t>
-      </w:r>
-      <w:r>
-        <w:rPr>
-          <w:lang w:val="nl"/>
-        </w:rPr>
-        <w:t xml:space="preserve"> </w:t>
-      </w:r>
-      <w:r>
-        <w:rPr>
-          <w:lang w:val="nl"/>
-        </w:rPr>
-        <w:t xml:space="preserve">maar</w:t>
-      </w:r>
-      <w:r>
-        <w:rPr>
-          <w:lang w:val="nl"/>
-        </w:rPr>
-        <w:t xml:space="preserve"> </w:t>
-      </w:r>
-      <w:r>
-        <w:rPr>
-          <w:b/>
-          <w:bCs/>
-          <w:lang w:val="nl"/>
-        </w:rPr>
-        <w:t xml:space="preserve">bestaande links, QR-codes en advertenties werken dan niet meer</w:t>
-      </w:r>
-      <w:r>
-        <w:rPr>
-          <w:lang w:val="nl"/>
-        </w:rPr>
-        <w:t xml:space="preserve">. Kies het adres dus</w:t>
-      </w:r>
-      <w:r>
-        <w:rPr>
-          <w:lang w:val="nl"/>
-        </w:rPr>
-        <w:t xml:space="preserve"> </w:t>
-      </w:r>
-      <w:r>
-        <w:rPr>
-          <w:lang w:val="nl"/>
-        </w:rPr>
-        <w:t xml:space="preserve">meteen goed.</w:t>
-      </w:r>
-    </w:p>
-    <w:p>
-      <w:pPr>
-        <w:pStyle w:val="BodyText"/>
-      </w:pPr>
-      <w:r>
-        <w:rPr>
-          <w:lang w:val="nl"/>
-        </w:rPr>
-        <w:t xml:space="preserve">Oude adressen uit de eerste versie van deze module (</w:t>
-      </w:r>
-      <w:r>
-        <w:rPr>
-          <w:rStyle w:val="VerbatimChar"/>
-          <w:lang w:val="nl"/>
-        </w:rPr>
-        <w:t xml:space="preserve">/l/&lt;naam&gt;</w:t>
-      </w:r>
-      <w:r>
-        <w:rPr>
-          <w:lang w:val="nl"/>
-        </w:rPr>
-        <w:t xml:space="preserve">) sturen automatisch door naar</w:t>
-      </w:r>
-      <w:r>
-        <w:rPr>
-          <w:lang w:val="nl"/>
-        </w:rPr>
-        <w:t xml:space="preserve"> </w:t>
-      </w:r>
-      <w:r>
-        <w:rPr>
-          <w:rStyle w:val="VerbatimChar"/>
-          <w:lang w:val="nl"/>
-        </w:rPr>
-        <w:t xml:space="preserve">/p/&lt;naam&gt;</w:t>
-      </w:r>
-      <w:r>
-        <w:rPr>
-          <w:lang w:val="nl"/>
-        </w:rPr>
-        <w:t xml:space="preserve">.</w:t>
-      </w:r>
-    </w:p>
-    <w:p>
-      <w:r>
-        <w:pict>
-          <v:rect style="width:0;height:1.5pt" o:hralign="center" o:hrstd="t" o:hr="t"/>
-        </w:pict>
-      </w:r>
-    </w:p>
-    <w:bookmarkEnd w:id="21"/>
-    <w:bookmarkStart w:id="22" w:name="een-pagina-verwijderen"/>
-    <w:p>
-      <w:pPr>
-        <w:pStyle w:val="Heading1"/>
-      </w:pPr>
-      <w:r>
-        <w:rPr>
-          <w:lang w:val="nl"/>
-        </w:rPr>
-        <w:t xml:space="preserve">Een pagina verwijderen</w:t>
-      </w:r>
-    </w:p>
-    <w:p>
-      <w:pPr>
-        <w:pStyle w:val="BlockText"/>
-      </w:pPr>
-      <w:r>
-        <w:rPr>
-          <w:b/>
-          <w:bCs/>
-          <w:lang w:val="nl"/>
-        </w:rPr>
-        <w:t xml:space="preserve">In het kort:</w:t>
-      </w:r>
-      <w:r>
-        <w:rPr>
-          <w:lang w:val="nl"/>
-        </w:rPr>
-        <w:t xml:space="preserve"> </w:t>
-      </w:r>
-      <w:r>
-        <w:rPr>
-          <w:lang w:val="nl"/>
-        </w:rPr>
-        <w:t xml:space="preserve">onderaan een pagina staat "Pagina verwijderen". De pagina, alle versies en de</w:t>
-      </w:r>
-      <w:r>
-        <w:rPr>
-          <w:lang w:val="nl"/>
-        </w:rPr>
-        <w:t xml:space="preserve"> </w:t>
-      </w:r>
-      <w:r>
-        <w:rPr>
-          <w:lang w:val="nl"/>
-        </w:rPr>
-        <w:t xml:space="preserve">afbeeldingen verdwijnen; aanmeldingen en de anonieme cijfers blijven.</w:t>
-      </w:r>
-    </w:p>
-    <w:p>
-      <w:pPr>
-        <w:pStyle w:val="FirstParagraph"/>
-      </w:pPr>
-      <w:r>
-        <w:rPr>
-          <w:lang w:val="nl"/>
-        </w:rPr>
-        <w:t xml:space="preserve">Onderaan het scherm van een pagina staat het blok</w:t>
-      </w:r>
-      <w:r>
-        <w:rPr>
-          <w:lang w:val="nl"/>
-        </w:rPr>
-        <w:t xml:space="preserve"> </w:t>
-      </w:r>
-      <w:r>
-        <w:rPr>
-          <w:b/>
-          <w:bCs/>
-          <w:lang w:val="nl"/>
-        </w:rPr>
-        <w:t xml:space="preserve">Verwijderen</w:t>
-      </w:r>
-      <w:r>
-        <w:rPr>
-          <w:lang w:val="nl"/>
-        </w:rPr>
-        <w:t xml:space="preserve"> </w:t>
-      </w:r>
-      <w:r>
-        <w:rPr>
-          <w:lang w:val="nl"/>
-        </w:rPr>
-        <w:t xml:space="preserve">(alleen als je het recht hebt om</w:t>
-      </w:r>
-      <w:r>
-        <w:rPr>
-          <w:lang w:val="nl"/>
-        </w:rPr>
-        <w:t xml:space="preserve"> </w:t>
-      </w:r>
-      <w:r>
-        <w:rPr>
-          <w:lang w:val="nl"/>
-        </w:rPr>
-        <w:t xml:space="preserve">pagina's te verwijderen). Na een bevestiging verdwijnt de pagina van het web, samen met alle</w:t>
-      </w:r>
-      <w:r>
-        <w:rPr>
-          <w:lang w:val="nl"/>
-        </w:rPr>
-        <w:t xml:space="preserve"> </w:t>
-      </w:r>
-      <w:r>
-        <w:rPr>
-          <w:lang w:val="nl"/>
-        </w:rPr>
-        <w:t xml:space="preserve">versies en geüploade bestanden. Aanmeldingen die er ooit via binnenkwamen blijven staan, en de</w:t>
-      </w:r>
-      <w:r>
-        <w:rPr>
-          <w:lang w:val="nl"/>
-        </w:rPr>
-        <w:t xml:space="preserve"> </w:t>
-      </w:r>
-      <w:r>
-        <w:rPr>
-          <w:lang w:val="nl"/>
-        </w:rPr>
-        <w:t xml:space="preserve">statistiek blijft anoniem bewaard. Dit is niet terug te draaien.</w:t>
-      </w:r>
-    </w:p>
-    <w:p>
-      <w:pPr>
-        <w:pStyle w:val="BodyText"/>
-      </w:pPr>
-      <w:r>
-        <w:rPr>
-          <w:lang w:val="nl"/>
-        </w:rPr>
-        <w:t xml:space="preserve">Wil je een pagina alleen tijdelijk offline halen, zet de status dan terug op</w:t>
-      </w:r>
-      <w:r>
-        <w:rPr>
-          <w:lang w:val="nl"/>
-        </w:rPr>
-        <w:t xml:space="preserve"> </w:t>
-      </w:r>
-      <w:r>
-        <w:rPr>
-          <w:b/>
-          <w:bCs/>
-          <w:lang w:val="nl"/>
-        </w:rPr>
-        <w:t xml:space="preserve">Concept</w:t>
-      </w:r>
-      <w:r>
-        <w:rPr>
-          <w:lang w:val="nl"/>
-        </w:rPr>
-        <w:t xml:space="preserve">.</w:t>
-      </w:r>
-    </w:p>
-    <w:p>
-      <w:r>
-        <w:pict>
-          <v:rect style="width:0;height:1.5pt" o:hralign="center" o:hrstd="t" o:hr="t"/>
-        </w:pict>
-      </w:r>
-    </w:p>
-    <w:bookmarkEnd w:id="22"/>
-    <w:bookmarkStart w:id="23" w:name="als-de-pagina-niet-laadt"/>
-    <w:p>
-      <w:pPr>
-        <w:pStyle w:val="Heading1"/>
-      </w:pPr>
-      <w:r>
-        <w:rPr>
-          <w:lang w:val="nl"/>
-        </w:rPr>
-        <w:t xml:space="preserve">Als de pagina niet laadt</w:t>
-      </w:r>
-    </w:p>
-    <w:p>
-      <w:pPr>
-        <w:pStyle w:val="BlockText"/>
-      </w:pPr>
-      <w:r>
-        <w:rPr>
-          <w:b/>
-          <w:bCs/>
-          <w:lang w:val="nl"/>
-        </w:rPr>
-        <w:t xml:space="preserve">In het kort:</w:t>
-      </w:r>
-      <w:r>
-        <w:rPr>
-          <w:lang w:val="nl"/>
-        </w:rPr>
-        <w:t xml:space="preserve"> </w:t>
-      </w:r>
-      <w:r>
-        <w:rPr>
-          <w:lang w:val="nl"/>
-        </w:rPr>
-        <w:t xml:space="preserve">controleer de status, of er een bevestigde versie live staat, en of er externe</w:t>
-      </w:r>
-      <w:r>
-        <w:rPr>
-          <w:lang w:val="nl"/>
-        </w:rPr>
-        <w:t xml:space="preserve"> </w:t>
-      </w:r>
-      <w:r>
-        <w:rPr>
-          <w:lang w:val="nl"/>
-        </w:rPr>
-        <w:t xml:space="preserve">bronnen worden geblokkeerd.</w:t>
+        <w:t xml:space="preserve">Daaronder staat</w:t>
+      </w:r>
+      <w:r>
+        <w:rPr>
+          <w:lang w:val="nl"/>
+        </w:rPr>
+        <w:t xml:space="preserve"> </w:t>
+      </w:r>
+      <w:r>
+        <w:rPr>
+          <w:b/>
+          <w:bCs/>
+          <w:lang w:val="nl"/>
+        </w:rPr>
+        <w:t xml:space="preserve">Waar haken mensen af?</w:t>
+      </w:r>
+      <w:r>
+        <w:rPr>
+          <w:lang w:val="nl"/>
+        </w:rPr>
+        <w:t xml:space="preserve">. Die trechter heeft deze treden:</w:t>
       </w:r>
     </w:p>
     <w:p>
@@ -5325,110 +4381,9 @@
       </w:pPr>
       <w:r>
         <w:rPr>
-          <w:b/>
-          <w:bCs/>
-          <w:lang w:val="nl"/>
-        </w:rPr>
-        <w:t xml:space="preserve">404 terwijl de pagina bestaat</w:t>
-      </w:r>
-      <w:r>
-        <w:rPr>
-          <w:lang w:val="nl"/>
-        </w:rPr>
-        <w:t xml:space="preserve">: staat de status op Gepubliceerd? En staat er een</w:t>
-      </w:r>
-      <w:r>
-        <w:rPr>
-          <w:lang w:val="nl"/>
-        </w:rPr>
-        <w:t xml:space="preserve"> </w:t>
-      </w:r>
-      <w:r>
-        <w:rPr>
-          <w:lang w:val="nl"/>
-        </w:rPr>
-        <w:t xml:space="preserve">bevestigde versie live (niet "Geen ontwerp")? Werkt</w:t>
-      </w:r>
-      <w:r>
-        <w:rPr>
-          <w:lang w:val="nl"/>
-        </w:rPr>
-        <w:t xml:space="preserve"> </w:t>
-      </w:r>
-      <w:r>
-        <w:rPr>
-          <w:rStyle w:val="VerbatimChar"/>
-          <w:lang w:val="nl"/>
-        </w:rPr>
-        <w:t xml:space="preserve">/p/&lt;naam&gt;</w:t>
-      </w:r>
-      <w:r>
-        <w:rPr>
-          <w:lang w:val="nl"/>
-        </w:rPr>
-        <w:t xml:space="preserve"> </w:t>
-      </w:r>
-      <w:r>
-        <w:rPr>
-          <w:lang w:val="nl"/>
-        </w:rPr>
-        <w:t xml:space="preserve">niet maar</w:t>
-      </w:r>
-      <w:r>
-        <w:rPr>
-          <w:lang w:val="nl"/>
-        </w:rPr>
-        <w:t xml:space="preserve"> </w:t>
-      </w:r>
-      <w:r>
-        <w:rPr>
-          <w:rStyle w:val="VerbatimChar"/>
-          <w:lang w:val="nl"/>
-        </w:rPr>
-        <w:t xml:space="preserve">/p.php?s=&lt;naam&gt;</w:t>
-      </w:r>
-      <w:r>
-        <w:rPr>
-          <w:lang w:val="nl"/>
-        </w:rPr>
-        <w:t xml:space="preserve"> </w:t>
-      </w:r>
-      <w:r>
-        <w:rPr>
-          <w:lang w:val="nl"/>
-        </w:rPr>
-        <w:t xml:space="preserve">wel, dan ontbreekt de rewrite-regel in</w:t>
-      </w:r>
-      <w:r>
-        <w:rPr>
-          <w:lang w:val="nl"/>
-        </w:rPr>
-        <w:t xml:space="preserve"> </w:t>
-      </w:r>
-      <w:r>
-        <w:rPr>
-          <w:rStyle w:val="VerbatimChar"/>
-          <w:lang w:val="nl"/>
-        </w:rPr>
-        <w:t xml:space="preserve">.htaccess</w:t>
-      </w:r>
-      <w:r>
-        <w:rPr>
-          <w:lang w:val="nl"/>
-        </w:rPr>
-        <w:t xml:space="preserve">; het overzichtsscherm laat dan zien welke</w:t>
-      </w:r>
-      <w:r>
-        <w:rPr>
-          <w:lang w:val="nl"/>
-        </w:rPr>
-        <w:t xml:space="preserve"> </w:t>
-      </w:r>
-      <w:r>
-        <w:rPr>
-          <w:lang w:val="nl"/>
-        </w:rPr>
-        <w:t xml:space="preserve">regels erin moeten.</w:t>
+          <w:lang w:val="nl"/>
+        </w:rPr>
+        <w:t xml:space="preserve">Pagina bekeken</w:t>
       </w:r>
     </w:p>
     <w:p>
@@ -5441,41 +4396,9 @@
       </w:pPr>
       <w:r>
         <w:rPr>
-          <w:b/>
-          <w:bCs/>
-          <w:lang w:val="nl"/>
-        </w:rPr>
-        <w:t xml:space="preserve">De pagina ziet er kaal uit</w:t>
-      </w:r>
-      <w:r>
-        <w:rPr>
-          <w:lang w:val="nl"/>
-        </w:rPr>
-        <w:t xml:space="preserve">: waarschijnlijk wordt een externe bron geblokkeerd. Kijk</w:t>
-      </w:r>
-      <w:r>
-        <w:rPr>
-          <w:lang w:val="nl"/>
-        </w:rPr>
-        <w:t xml:space="preserve"> </w:t>
-      </w:r>
-      <w:r>
-        <w:rPr>
-          <w:lang w:val="nl"/>
-        </w:rPr>
-        <w:t xml:space="preserve">in het rapport van de versie welke hosts erin zitten en sta ze toe, of zet de opmaak in</w:t>
-      </w:r>
-      <w:r>
-        <w:rPr>
-          <w:lang w:val="nl"/>
-        </w:rPr>
-        <w:t xml:space="preserve"> </w:t>
-      </w:r>
-      <w:r>
-        <w:rPr>
-          <w:lang w:val="nl"/>
-        </w:rPr>
-        <w:t xml:space="preserve">het bestand zelf.</w:t>
+          <w:lang w:val="nl"/>
+        </w:rPr>
+        <w:t xml:space="preserve">Stap 1 · Naam (begonnen met invullen)</w:t>
       </w:r>
     </w:p>
     <w:p>
@@ -5488,66 +4411,9 @@
       </w:pPr>
       <w:r>
         <w:rPr>
-          <w:b/>
-          <w:bCs/>
-          <w:lang w:val="nl"/>
-        </w:rPr>
-        <w:t xml:space="preserve">Het formulier staat er niet</w:t>
-      </w:r>
-      <w:r>
-        <w:rPr>
-          <w:lang w:val="nl"/>
-        </w:rPr>
-        <w:t xml:space="preserve">:</w:t>
-      </w:r>
-      <w:r>
-        <w:rPr>
-          <w:lang w:val="nl"/>
-        </w:rPr>
-        <w:t xml:space="preserve"> </w:t>
-      </w:r>
-      <w:r>
-        <w:rPr>
-          <w:rStyle w:val="VerbatimChar"/>
-          <w:lang w:val="nl"/>
-        </w:rPr>
-        <w:t xml:space="preserve">[[formulier]]</w:t>
-      </w:r>
-      <w:r>
-        <w:rPr>
-          <w:lang w:val="nl"/>
-        </w:rPr>
-        <w:t xml:space="preserve"> </w:t>
-      </w:r>
-      <w:r>
-        <w:rPr>
-          <w:lang w:val="nl"/>
-        </w:rPr>
-        <w:t xml:space="preserve">ontbreekt in het ontwerp, of het seizoen</w:t>
-      </w:r>
-      <w:r>
-        <w:rPr>
-          <w:lang w:val="nl"/>
-        </w:rPr>
-        <w:t xml:space="preserve"> </w:t>
-      </w:r>
-      <w:r>
-        <w:rPr>
-          <w:lang w:val="nl"/>
-        </w:rPr>
-        <w:t xml:space="preserve">staat niet op "open". In dat laatste geval verschijnt er een melding dat de aanmelding</w:t>
-      </w:r>
-      <w:r>
-        <w:rPr>
-          <w:lang w:val="nl"/>
-        </w:rPr>
-        <w:t xml:space="preserve"> </w:t>
-      </w:r>
-      <w:r>
-        <w:rPr>
-          <w:lang w:val="nl"/>
-        </w:rPr>
-        <w:t xml:space="preserve">gesloten is.</w:t>
+          <w:lang w:val="nl"/>
+        </w:rPr>
+        <w:t xml:space="preserve">Stap 2 · Jij</w:t>
       </w:r>
     </w:p>
     <w:p>
@@ -5556,6 +4422,1428 @@
         <w:numPr>
           <w:ilvl w:val="0"/>
           <w:numId w:val="1007"/>
+        </w:numPr>
+      </w:pPr>
+      <w:r>
+        <w:rPr>
+          <w:lang w:val="nl"/>
+        </w:rPr>
+        <w:t xml:space="preserve">Stap 3 · Contact</w:t>
+      </w:r>
+    </w:p>
+    <w:p>
+      <w:pPr>
+        <w:pStyle w:val="Compact"/>
+        <w:numPr>
+          <w:ilvl w:val="0"/>
+          <w:numId w:val="1007"/>
+        </w:numPr>
+      </w:pPr>
+      <w:r>
+        <w:rPr>
+          <w:lang w:val="nl"/>
+        </w:rPr>
+        <w:t xml:space="preserve">Aanmelding verstuurd</w:t>
+      </w:r>
+    </w:p>
+    <w:p>
+      <w:pPr>
+        <w:pStyle w:val="FirstParagraph"/>
+      </w:pPr>
+      <w:r>
+        <w:rPr>
+          <w:lang w:val="nl"/>
+        </w:rPr>
+        <w:t xml:space="preserve">Bij elke trede staat het aantal en het percentage van iedereen die aan het formulier begon. Waar</w:t>
+      </w:r>
+      <w:r>
+        <w:rPr>
+          <w:lang w:val="nl"/>
+        </w:rPr>
+        <w:t xml:space="preserve"> </w:t>
+      </w:r>
+      <w:r>
+        <w:rPr>
+          <w:lang w:val="nl"/>
+        </w:rPr>
+        <w:t xml:space="preserve">mensen afvallen, staat "… gingen hier niet verder".</w:t>
+      </w:r>
+    </w:p>
+    <w:p>
+      <w:pPr>
+        <w:pStyle w:val="BodyText"/>
+      </w:pPr>
+      <w:r>
+        <w:rPr>
+          <w:lang w:val="nl"/>
+        </w:rPr>
+        <w:t xml:space="preserve">Los daaronder staat</w:t>
+      </w:r>
+      <w:r>
+        <w:rPr>
+          <w:lang w:val="nl"/>
+        </w:rPr>
+        <w:t xml:space="preserve"> </w:t>
+      </w:r>
+      <w:r>
+        <w:rPr>
+          <w:b/>
+          <w:bCs/>
+          <w:lang w:val="nl"/>
+        </w:rPr>
+        <w:t xml:space="preserve">Halverwege weggegaan</w:t>
+      </w:r>
+      <w:r>
+        <w:rPr>
+          <w:lang w:val="nl"/>
+        </w:rPr>
+        <w:t xml:space="preserve">, per stap. Dat is geen telling maar een aanwijzing.</w:t>
+      </w:r>
+      <w:r>
+        <w:rPr>
+          <w:lang w:val="nl"/>
+        </w:rPr>
+        <w:t xml:space="preserve"> </w:t>
+      </w:r>
+      <w:r>
+        <w:rPr>
+          <w:lang w:val="nl"/>
+        </w:rPr>
+        <w:t xml:space="preserve">Het signaal komt van een tabblad dat naar de achtergrond gaat, en dat gebeurt ook als iemand even</w:t>
+      </w:r>
+      <w:r>
+        <w:rPr>
+          <w:lang w:val="nl"/>
+        </w:rPr>
+        <w:t xml:space="preserve"> </w:t>
+      </w:r>
+      <w:r>
+        <w:rPr>
+          <w:lang w:val="nl"/>
+        </w:rPr>
+        <w:t xml:space="preserve">iets opzoekt en daarna gewoon doorgaat. Gebruik het om te zien bij welke stap het vaakst gebeurt,</w:t>
+      </w:r>
+      <w:r>
+        <w:rPr>
+          <w:lang w:val="nl"/>
+        </w:rPr>
+        <w:t xml:space="preserve"> </w:t>
+      </w:r>
+      <w:r>
+        <w:rPr>
+          <w:lang w:val="nl"/>
+        </w:rPr>
+        <w:t xml:space="preserve">niet als aantal afhakers.</w:t>
+      </w:r>
+    </w:p>
+    <w:p>
+      <w:pPr>
+        <w:pStyle w:val="BodyText"/>
+      </w:pPr>
+      <w:r>
+        <w:rPr>
+          <w:lang w:val="nl"/>
+        </w:rPr>
+        <w:t xml:space="preserve">Is er nog niets gemeten, dan staat er dat de cijfers verschijnen zodra de pagina gepubliceerd is</w:t>
+      </w:r>
+      <w:r>
+        <w:rPr>
+          <w:lang w:val="nl"/>
+        </w:rPr>
+        <w:t xml:space="preserve"> </w:t>
+      </w:r>
+      <w:r>
+        <w:rPr>
+          <w:lang w:val="nl"/>
+        </w:rPr>
+        <w:t xml:space="preserve">en er bezoekers komen.</w:t>
+      </w:r>
+    </w:p>
+    <w:p>
+      <w:r>
+        <w:pict>
+          <v:rect style="width:0;height:1.5pt" o:hralign="center" o:hrstd="t" o:hr="t"/>
+        </w:pict>
+      </w:r>
+    </w:p>
+    <w:bookmarkEnd w:id="18"/>
+    <w:bookmarkStart w:id="19" w:name="herkomst-bijhouden"/>
+    <w:p>
+      <w:pPr>
+        <w:pStyle w:val="Heading1"/>
+      </w:pPr>
+      <w:r>
+        <w:rPr>
+          <w:lang w:val="nl"/>
+        </w:rPr>
+        <w:t xml:space="preserve">Herkomst bijhouden</w:t>
+      </w:r>
+    </w:p>
+    <w:p>
+      <w:pPr>
+        <w:pStyle w:val="BlockText"/>
+      </w:pPr>
+      <w:r>
+        <w:rPr>
+          <w:b/>
+          <w:bCs/>
+          <w:lang w:val="nl"/>
+        </w:rPr>
+        <w:t xml:space="preserve">In het kort:</w:t>
+      </w:r>
+      <w:r>
+        <w:rPr>
+          <w:lang w:val="nl"/>
+        </w:rPr>
+        <w:t xml:space="preserve"> </w:t>
+      </w:r>
+      <w:r>
+        <w:rPr>
+          <w:lang w:val="nl"/>
+        </w:rPr>
+        <w:t xml:space="preserve">elke pagina heeft een bron-code die meereist tot in het dossier van de</w:t>
+      </w:r>
+      <w:r>
+        <w:rPr>
+          <w:lang w:val="nl"/>
+        </w:rPr>
+        <w:t xml:space="preserve"> </w:t>
+      </w:r>
+      <w:r>
+        <w:rPr>
+          <w:lang w:val="nl"/>
+        </w:rPr>
+        <w:t xml:space="preserve">sollicitant. Onderaan het overzicht zie je per bron hoeveel aanmeldingen er kwamen en hoeveel</w:t>
+      </w:r>
+      <w:r>
+        <w:rPr>
+          <w:lang w:val="nl"/>
+        </w:rPr>
+        <w:t xml:space="preserve"> </w:t>
+      </w:r>
+      <w:r>
+        <w:rPr>
+          <w:lang w:val="nl"/>
+        </w:rPr>
+        <w:t xml:space="preserve">daarvan zijn aangenomen.</w:t>
+      </w:r>
+    </w:p>
+    <w:p>
+      <w:pPr>
+        <w:pStyle w:val="FirstParagraph"/>
+      </w:pPr>
+      <w:r>
+        <w:rPr>
+          <w:lang w:val="nl"/>
+        </w:rPr>
+        <w:t xml:space="preserve">Elke pagina heeft een</w:t>
+      </w:r>
+      <w:r>
+        <w:rPr>
+          <w:lang w:val="nl"/>
+        </w:rPr>
+        <w:t xml:space="preserve"> </w:t>
+      </w:r>
+      <w:r>
+        <w:rPr>
+          <w:b/>
+          <w:bCs/>
+          <w:lang w:val="nl"/>
+        </w:rPr>
+        <w:t xml:space="preserve">bron-code</w:t>
+      </w:r>
+      <w:r>
+        <w:rPr>
+          <w:lang w:val="nl"/>
+        </w:rPr>
+        <w:t xml:space="preserve">. Je stelt hem in bij "Gegevens"; laat je het veld leeg, dan</w:t>
+      </w:r>
+      <w:r>
+        <w:rPr>
+          <w:lang w:val="nl"/>
+        </w:rPr>
+        <w:t xml:space="preserve"> </w:t>
+      </w:r>
+      <w:r>
+        <w:rPr>
+          <w:lang w:val="nl"/>
+        </w:rPr>
+        <w:t xml:space="preserve">wordt het adres van de pagina gebruikt. De code reist mee tot in het dossier van de sollicitant,</w:t>
+      </w:r>
+      <w:r>
+        <w:rPr>
+          <w:lang w:val="nl"/>
+        </w:rPr>
+        <w:t xml:space="preserve"> </w:t>
+      </w:r>
+      <w:r>
+        <w:rPr>
+          <w:lang w:val="nl"/>
+        </w:rPr>
+        <w:t xml:space="preserve">dus je ziet later precies welke pagina welke aanmeldingen heeft opgeleverd, en hoeveel daarvan</w:t>
+      </w:r>
+      <w:r>
+        <w:rPr>
+          <w:lang w:val="nl"/>
+        </w:rPr>
+        <w:t xml:space="preserve"> </w:t>
+      </w:r>
+      <w:r>
+        <w:rPr>
+          <w:lang w:val="nl"/>
+        </w:rPr>
+        <w:t xml:space="preserve">uiteindelijk zijn aangenomen.</w:t>
+      </w:r>
+    </w:p>
+    <w:p>
+      <w:pPr>
+        <w:pStyle w:val="BodyText"/>
+      </w:pPr>
+      <w:r>
+        <w:rPr>
+          <w:lang w:val="nl"/>
+        </w:rPr>
+        <w:t xml:space="preserve">Dat overzicht staat onderaan het overzicht van wervingspagina's, onder</w:t>
+      </w:r>
+      <w:r>
+        <w:rPr>
+          <w:lang w:val="nl"/>
+        </w:rPr>
+        <w:t xml:space="preserve"> </w:t>
+      </w:r>
+      <w:r>
+        <w:rPr>
+          <w:b/>
+          <w:bCs/>
+          <w:lang w:val="nl"/>
+        </w:rPr>
+        <w:t xml:space="preserve">Waar komen aanmeldingen</w:t>
+      </w:r>
+      <w:r>
+        <w:rPr>
+          <w:b/>
+          <w:bCs/>
+          <w:lang w:val="nl"/>
+        </w:rPr>
+        <w:t xml:space="preserve"> </w:t>
+      </w:r>
+      <w:r>
+        <w:rPr>
+          <w:b/>
+          <w:bCs/>
+          <w:lang w:val="nl"/>
+        </w:rPr>
+        <w:t xml:space="preserve">vandaan?</w:t>
+      </w:r>
+      <w:r>
+        <w:rPr>
+          <w:lang w:val="nl"/>
+        </w:rPr>
+        <w:t xml:space="preserve">: per bron het aantal aanmeldingen, het aantal aangenomen en het aandeel.</w:t>
+      </w:r>
+    </w:p>
+    <w:p>
+      <w:pPr>
+        <w:pStyle w:val="BodyText"/>
+      </w:pPr>
+      <w:r>
+        <w:rPr>
+          <w:lang w:val="nl"/>
+        </w:rPr>
+        <w:t xml:space="preserve">Gebruik je het gewone aanmeldformulier voor meerdere advertenties, dan kun je de bron ook in het</w:t>
+      </w:r>
+      <w:r>
+        <w:rPr>
+          <w:lang w:val="nl"/>
+        </w:rPr>
+        <w:t xml:space="preserve"> </w:t>
+      </w:r>
+      <w:r>
+        <w:rPr>
+          <w:lang w:val="nl"/>
+        </w:rPr>
+        <w:t xml:space="preserve">adres meegeven:</w:t>
+      </w:r>
+      <w:r>
+        <w:rPr>
+          <w:lang w:val="nl"/>
+        </w:rPr>
+        <w:t xml:space="preserve"> </w:t>
+      </w:r>
+      <w:r>
+        <w:rPr>
+          <w:rStyle w:val="VerbatimChar"/>
+          <w:lang w:val="nl"/>
+        </w:rPr>
+        <w:t xml:space="preserve">https://sollicitatie.paal13.com/aanmelden.php?bron=instagram-mei</w:t>
+      </w:r>
+      <w:r>
+        <w:rPr>
+          <w:lang w:val="nl"/>
+        </w:rPr>
+        <w:t xml:space="preserve">.</w:t>
+      </w:r>
+    </w:p>
+    <w:p>
+      <w:pPr>
+        <w:pStyle w:val="BodyText"/>
+      </w:pPr>
+      <w:r>
+        <w:rPr>
+          <w:lang w:val="nl"/>
+        </w:rPr>
+        <w:t xml:space="preserve">Het veld</w:t>
+      </w:r>
+      <w:r>
+        <w:rPr>
+          <w:lang w:val="nl"/>
+        </w:rPr>
+        <w:t xml:space="preserve"> </w:t>
+      </w:r>
+      <w:r>
+        <w:rPr>
+          <w:b/>
+          <w:bCs/>
+          <w:lang w:val="nl"/>
+        </w:rPr>
+        <w:t xml:space="preserve">Doelgroep</w:t>
+      </w:r>
+      <w:r>
+        <w:rPr>
+          <w:lang w:val="nl"/>
+        </w:rPr>
+        <w:t xml:space="preserve"> </w:t>
+      </w:r>
+      <w:r>
+        <w:rPr>
+          <w:lang w:val="nl"/>
+        </w:rPr>
+        <w:t xml:space="preserve">bij "Gegevens" is alleen voor jezelf; het staat in het overzicht achter het</w:t>
+      </w:r>
+      <w:r>
+        <w:rPr>
+          <w:lang w:val="nl"/>
+        </w:rPr>
+        <w:t xml:space="preserve"> </w:t>
+      </w:r>
+      <w:r>
+        <w:rPr>
+          <w:lang w:val="nl"/>
+        </w:rPr>
+        <w:t xml:space="preserve">adres.</w:t>
+      </w:r>
+    </w:p>
+    <w:p>
+      <w:r>
+        <w:pict>
+          <v:rect style="width:0;height:1.5pt" o:hralign="center" o:hrstd="t" o:hr="t"/>
+        </w:pict>
+      </w:r>
+    </w:p>
+    <w:bookmarkEnd w:id="19"/>
+    <w:bookmarkStart w:id="20" w:name="wat-we-van-bezoekers-bijhouden"/>
+    <w:p>
+      <w:pPr>
+        <w:pStyle w:val="Heading1"/>
+      </w:pPr>
+      <w:r>
+        <w:rPr>
+          <w:lang w:val="nl"/>
+        </w:rPr>
+        <w:t xml:space="preserve">Wat we van bezoekers bijhouden</w:t>
+      </w:r>
+    </w:p>
+    <w:p>
+      <w:pPr>
+        <w:pStyle w:val="BlockText"/>
+      </w:pPr>
+      <w:r>
+        <w:rPr>
+          <w:b/>
+          <w:bCs/>
+          <w:lang w:val="nl"/>
+        </w:rPr>
+        <w:t xml:space="preserve">In het kort:</w:t>
+      </w:r>
+      <w:r>
+        <w:rPr>
+          <w:lang w:val="nl"/>
+        </w:rPr>
+        <w:t xml:space="preserve"> </w:t>
+      </w:r>
+      <w:r>
+        <w:rPr>
+          <w:lang w:val="nl"/>
+        </w:rPr>
+        <w:t xml:space="preserve">zo min mogelijk. Geen cookies, geen sessie, geen cookiemelding nodig. Alleen</w:t>
+      </w:r>
+      <w:r>
+        <w:rPr>
+          <w:lang w:val="nl"/>
+        </w:rPr>
+        <w:t xml:space="preserve"> </w:t>
+      </w:r>
+      <w:r>
+        <w:rPr>
+          <w:lang w:val="nl"/>
+        </w:rPr>
+        <w:t xml:space="preserve">tellingen, met een code die elke dag verandert.</w:t>
+      </w:r>
+    </w:p>
+    <w:p>
+      <w:pPr>
+        <w:pStyle w:val="FirstParagraph"/>
+      </w:pPr>
+      <w:r>
+        <w:rPr>
+          <w:lang w:val="nl"/>
+        </w:rPr>
+        <w:t xml:space="preserve">De pagina zet</w:t>
+      </w:r>
+      <w:r>
+        <w:rPr>
+          <w:lang w:val="nl"/>
+        </w:rPr>
+        <w:t xml:space="preserve"> </w:t>
+      </w:r>
+      <w:r>
+        <w:rPr>
+          <w:b/>
+          <w:bCs/>
+          <w:lang w:val="nl"/>
+        </w:rPr>
+        <w:t xml:space="preserve">geen cookies</w:t>
+      </w:r>
+      <w:r>
+        <w:rPr>
+          <w:lang w:val="nl"/>
+        </w:rPr>
+        <w:t xml:space="preserve"> </w:t>
+      </w:r>
+      <w:r>
+        <w:rPr>
+          <w:lang w:val="nl"/>
+        </w:rPr>
+        <w:t xml:space="preserve">en start geen sessie, dus er is geen cookiemelding nodig.</w:t>
+      </w:r>
+    </w:p>
+    <w:p>
+      <w:pPr>
+        <w:pStyle w:val="BodyText"/>
+      </w:pPr>
+      <w:r>
+        <w:rPr>
+          <w:lang w:val="nl"/>
+        </w:rPr>
+        <w:t xml:space="preserve">Om unieke bezoekers te kunnen tellen wordt een versleutelde code bewaard die elke dag</w:t>
+      </w:r>
+      <w:r>
+        <w:rPr>
+          <w:lang w:val="nl"/>
+        </w:rPr>
+        <w:t xml:space="preserve"> </w:t>
+      </w:r>
+      <w:r>
+        <w:rPr>
+          <w:lang w:val="nl"/>
+        </w:rPr>
+        <w:t xml:space="preserve">verandert en niet naar een persoon te herleiden is. Die code wordt na 30 dagen gewist; de</w:t>
+      </w:r>
+      <w:r>
+        <w:rPr>
+          <w:lang w:val="nl"/>
+        </w:rPr>
+        <w:t xml:space="preserve"> </w:t>
+      </w:r>
+      <w:r>
+        <w:rPr>
+          <w:lang w:val="nl"/>
+        </w:rPr>
+        <w:t xml:space="preserve">aantallen blijven. De cijfers zelf verdwijnen na 13 maanden. Beide termijnen staan bij</w:t>
+      </w:r>
+      <w:r>
+        <w:rPr>
+          <w:lang w:val="nl"/>
+        </w:rPr>
+        <w:t xml:space="preserve"> </w:t>
+      </w:r>
+      <w:r>
+        <w:rPr>
+          <w:b/>
+          <w:bCs/>
+          <w:lang w:val="nl"/>
+        </w:rPr>
+        <w:t xml:space="preserve">Instellingen › Bewaren &amp; opschonen</w:t>
+      </w:r>
+      <w:r>
+        <w:rPr>
+          <w:lang w:val="nl"/>
+        </w:rPr>
+        <w:t xml:space="preserve"> </w:t>
+      </w:r>
+      <w:r>
+        <w:rPr>
+          <w:lang w:val="nl"/>
+        </w:rPr>
+        <w:t xml:space="preserve">("Herkenning unieke bezoekers" en "Bezoekersstatistiek</w:t>
+      </w:r>
+      <w:r>
+        <w:rPr>
+          <w:lang w:val="nl"/>
+        </w:rPr>
+        <w:t xml:space="preserve"> </w:t>
+      </w:r>
+      <w:r>
+        <w:rPr>
+          <w:lang w:val="nl"/>
+        </w:rPr>
+        <w:t xml:space="preserve">wervingspagina's"). Het wissen gebeurt alleen als daar "Automatisch opschonen inschakelen" aan</w:t>
+      </w:r>
+      <w:r>
+        <w:rPr>
+          <w:lang w:val="nl"/>
+        </w:rPr>
+        <w:t xml:space="preserve"> </w:t>
+      </w:r>
+      <w:r>
+        <w:rPr>
+          <w:lang w:val="nl"/>
+        </w:rPr>
+        <w:t xml:space="preserve">staat.</w:t>
+      </w:r>
+    </w:p>
+    <w:p>
+      <w:pPr>
+        <w:pStyle w:val="BodyText"/>
+      </w:pPr>
+      <w:r>
+        <w:rPr>
+          <w:lang w:val="nl"/>
+        </w:rPr>
+        <w:t xml:space="preserve">Dezelfde bezoeker telt hooguit</w:t>
+      </w:r>
+      <w:r>
+        <w:rPr>
+          <w:lang w:val="nl"/>
+        </w:rPr>
+        <w:t xml:space="preserve"> </w:t>
+      </w:r>
+      <w:r>
+        <w:rPr>
+          <w:b/>
+          <w:bCs/>
+          <w:lang w:val="nl"/>
+        </w:rPr>
+        <w:t xml:space="preserve">eens per 30 minuten</w:t>
+      </w:r>
+      <w:r>
+        <w:rPr>
+          <w:lang w:val="nl"/>
+        </w:rPr>
+        <w:t xml:space="preserve"> </w:t>
+      </w:r>
+      <w:r>
+        <w:rPr>
+          <w:lang w:val="nl"/>
+        </w:rPr>
+        <w:t xml:space="preserve">als bezoek op dezelfde pagina.</w:t>
+      </w:r>
+      <w:r>
+        <w:rPr>
+          <w:lang w:val="nl"/>
+        </w:rPr>
+        <w:t xml:space="preserve"> </w:t>
+      </w:r>
+      <w:r>
+        <w:rPr>
+          <w:lang w:val="nl"/>
+        </w:rPr>
+        <w:t xml:space="preserve">Vernieuwen, de terug-knop en een tabblad dat door de browser in de slaapstand is gezet en</w:t>
+      </w:r>
+      <w:r>
+        <w:rPr>
+          <w:lang w:val="nl"/>
+        </w:rPr>
+        <w:t xml:space="preserve"> </w:t>
+      </w:r>
+      <w:r>
+        <w:rPr>
+          <w:lang w:val="nl"/>
+        </w:rPr>
+        <w:t xml:space="preserve">daarna opnieuw laadt, tellen dus niet opnieuw mee. Bekende zoekmachines en andere robots tellen</w:t>
+      </w:r>
+      <w:r>
+        <w:rPr>
+          <w:lang w:val="nl"/>
+        </w:rPr>
+        <w:t xml:space="preserve"> </w:t>
+      </w:r>
+      <w:r>
+        <w:rPr>
+          <w:lang w:val="nl"/>
+        </w:rPr>
+        <w:t xml:space="preserve">niet mee.</w:t>
+      </w:r>
+    </w:p>
+    <w:p>
+      <w:pPr>
+        <w:pStyle w:val="BodyText"/>
+      </w:pPr>
+      <w:r>
+        <w:rPr>
+          <w:lang w:val="nl"/>
+        </w:rPr>
+        <w:t xml:space="preserve">Naast het bezoek houden we bij hoever iemand in het formulier kwam: begonnen met invullen,</w:t>
+      </w:r>
+      <w:r>
+        <w:rPr>
+          <w:lang w:val="nl"/>
+        </w:rPr>
+        <w:t xml:space="preserve"> </w:t>
+      </w:r>
+      <w:r>
+        <w:rPr>
+          <w:lang w:val="nl"/>
+        </w:rPr>
+        <w:t xml:space="preserve">stap 2 bereikt, stap 3 bereikt, verstuurd. Daarvan staat alleen het stapnummer geregistreerd,</w:t>
+      </w:r>
+      <w:r>
+        <w:rPr>
+          <w:lang w:val="nl"/>
+        </w:rPr>
+        <w:t xml:space="preserve"> </w:t>
+      </w:r>
+      <w:r>
+        <w:rPr>
+          <w:lang w:val="nl"/>
+        </w:rPr>
+        <w:t xml:space="preserve">nooit iets wat iemand heeft ingetypt.</w:t>
+      </w:r>
+    </w:p>
+    <w:p>
+      <w:pPr>
+        <w:pStyle w:val="BodyText"/>
+      </w:pPr>
+      <w:r>
+        <w:rPr>
+          <w:lang w:val="nl"/>
+        </w:rPr>
+        <w:t xml:space="preserve">Wil je helemaal niets meten, zet dan onder</w:t>
+      </w:r>
+      <w:r>
+        <w:rPr>
+          <w:lang w:val="nl"/>
+        </w:rPr>
+        <w:t xml:space="preserve"> </w:t>
+      </w:r>
+      <w:r>
+        <w:rPr>
+          <w:b/>
+          <w:bCs/>
+          <w:lang w:val="nl"/>
+        </w:rPr>
+        <w:t xml:space="preserve">Instellingen › Bewaren &amp; opschonen</w:t>
+      </w:r>
+      <w:r>
+        <w:rPr>
+          <w:lang w:val="nl"/>
+        </w:rPr>
+        <w:t xml:space="preserve"> </w:t>
+      </w:r>
+      <w:r>
+        <w:rPr>
+          <w:lang w:val="nl"/>
+        </w:rPr>
+        <w:t xml:space="preserve">het vinkje</w:t>
+      </w:r>
+      <w:r>
+        <w:rPr>
+          <w:lang w:val="nl"/>
+        </w:rPr>
+        <w:t xml:space="preserve"> </w:t>
+      </w:r>
+      <w:r>
+        <w:rPr>
+          <w:b/>
+          <w:bCs/>
+          <w:lang w:val="nl"/>
+        </w:rPr>
+        <w:t xml:space="preserve">Bezoekersstatistiek op de wervingspagina's en het aanmeldformulier</w:t>
+      </w:r>
+      <w:r>
+        <w:rPr>
+          <w:lang w:val="nl"/>
+        </w:rPr>
+        <w:t xml:space="preserve"> </w:t>
+      </w:r>
+      <w:r>
+        <w:rPr>
+          <w:lang w:val="nl"/>
+        </w:rPr>
+        <w:t xml:space="preserve">uit (standaard staat het</w:t>
+      </w:r>
+      <w:r>
+        <w:rPr>
+          <w:lang w:val="nl"/>
+        </w:rPr>
+        <w:t xml:space="preserve"> </w:t>
+      </w:r>
+      <w:r>
+        <w:rPr>
+          <w:lang w:val="nl"/>
+        </w:rPr>
+        <w:t xml:space="preserve">aan). Dan schrijft het systeem geen enkele gebeurtenis meer weg en verdwijnt ook het meetadres uit</w:t>
+      </w:r>
+      <w:r>
+        <w:rPr>
+          <w:lang w:val="nl"/>
+        </w:rPr>
+        <w:t xml:space="preserve"> </w:t>
+      </w:r>
+      <w:r>
+        <w:rPr>
+          <w:lang w:val="nl"/>
+        </w:rPr>
+        <w:t xml:space="preserve">de pagina. Wat al geteld is, blijft staan volgens de termijnen hierboven.</w:t>
+      </w:r>
+    </w:p>
+    <w:p>
+      <w:pPr>
+        <w:pStyle w:val="BodyText"/>
+      </w:pPr>
+      <w:r>
+        <w:rPr>
+          <w:lang w:val="nl"/>
+        </w:rPr>
+        <w:t xml:space="preserve">Let op: zet je ontwerp zelf een cookie of een tracker, dan gelden de gewone regels wél en is</w:t>
+      </w:r>
+      <w:r>
+        <w:rPr>
+          <w:lang w:val="nl"/>
+        </w:rPr>
+        <w:t xml:space="preserve"> </w:t>
+      </w:r>
+      <w:r>
+        <w:rPr>
+          <w:lang w:val="nl"/>
+        </w:rPr>
+        <w:t xml:space="preserve">de brigade daarvoor verantwoordelijk. Het rapport waarschuwt daarvoor, en de browser</w:t>
+      </w:r>
+      <w:r>
+        <w:rPr>
+          <w:lang w:val="nl"/>
+        </w:rPr>
+        <w:t xml:space="preserve"> </w:t>
+      </w:r>
+      <w:r>
+        <w:rPr>
+          <w:lang w:val="nl"/>
+        </w:rPr>
+        <w:t xml:space="preserve">blokkeert het tot je het toestaat.</w:t>
+      </w:r>
+    </w:p>
+    <w:p>
+      <w:r>
+        <w:pict>
+          <v:rect style="width:0;height:1.5pt" o:hralign="center" o:hrstd="t" o:hr="t"/>
+        </w:pict>
+      </w:r>
+    </w:p>
+    <w:bookmarkEnd w:id="20"/>
+    <w:bookmarkStart w:id="21" w:name="het-adres-wijzigen"/>
+    <w:p>
+      <w:pPr>
+        <w:pStyle w:val="Heading1"/>
+      </w:pPr>
+      <w:r>
+        <w:rPr>
+          <w:lang w:val="nl"/>
+        </w:rPr>
+        <w:t xml:space="preserve">Het adres wijzigen</w:t>
+      </w:r>
+    </w:p>
+    <w:p>
+      <w:pPr>
+        <w:pStyle w:val="BlockText"/>
+      </w:pPr>
+      <w:r>
+        <w:rPr>
+          <w:b/>
+          <w:bCs/>
+          <w:lang w:val="nl"/>
+        </w:rPr>
+        <w:t xml:space="preserve">In het kort:</w:t>
+      </w:r>
+      <w:r>
+        <w:rPr>
+          <w:lang w:val="nl"/>
+        </w:rPr>
+        <w:t xml:space="preserve"> </w:t>
+      </w:r>
+      <w:r>
+        <w:rPr>
+          <w:lang w:val="nl"/>
+        </w:rPr>
+        <w:t xml:space="preserve">kan, maar bestaande links, QR-codes en advertenties werken daarna niet meer.</w:t>
+      </w:r>
+    </w:p>
+    <w:p>
+      <w:pPr>
+        <w:pStyle w:val="FirstParagraph"/>
+      </w:pPr>
+      <w:r>
+        <w:rPr>
+          <w:lang w:val="nl"/>
+        </w:rPr>
+        <w:t xml:space="preserve">Wijzig je bij "Gegevens" het adres van een pagina, dan verhuizen de afbeeldingen automatisch mee,</w:t>
+      </w:r>
+      <w:r>
+        <w:rPr>
+          <w:lang w:val="nl"/>
+        </w:rPr>
+        <w:t xml:space="preserve"> </w:t>
+      </w:r>
+      <w:r>
+        <w:rPr>
+          <w:lang w:val="nl"/>
+        </w:rPr>
+        <w:t xml:space="preserve">maar</w:t>
+      </w:r>
+      <w:r>
+        <w:rPr>
+          <w:lang w:val="nl"/>
+        </w:rPr>
+        <w:t xml:space="preserve"> </w:t>
+      </w:r>
+      <w:r>
+        <w:rPr>
+          <w:b/>
+          <w:bCs/>
+          <w:lang w:val="nl"/>
+        </w:rPr>
+        <w:t xml:space="preserve">bestaande links, QR-codes en advertenties werken dan niet meer</w:t>
+      </w:r>
+      <w:r>
+        <w:rPr>
+          <w:lang w:val="nl"/>
+        </w:rPr>
+        <w:t xml:space="preserve">. Kies het adres dus</w:t>
+      </w:r>
+      <w:r>
+        <w:rPr>
+          <w:lang w:val="nl"/>
+        </w:rPr>
+        <w:t xml:space="preserve"> </w:t>
+      </w:r>
+      <w:r>
+        <w:rPr>
+          <w:lang w:val="nl"/>
+        </w:rPr>
+        <w:t xml:space="preserve">meteen goed.</w:t>
+      </w:r>
+    </w:p>
+    <w:p>
+      <w:pPr>
+        <w:pStyle w:val="BodyText"/>
+      </w:pPr>
+      <w:r>
+        <w:rPr>
+          <w:lang w:val="nl"/>
+        </w:rPr>
+        <w:t xml:space="preserve">Oude adressen uit de eerste versie van deze module (</w:t>
+      </w:r>
+      <w:r>
+        <w:rPr>
+          <w:rStyle w:val="VerbatimChar"/>
+          <w:lang w:val="nl"/>
+        </w:rPr>
+        <w:t xml:space="preserve">/l/&lt;naam&gt;</w:t>
+      </w:r>
+      <w:r>
+        <w:rPr>
+          <w:lang w:val="nl"/>
+        </w:rPr>
+        <w:t xml:space="preserve">) sturen automatisch door naar</w:t>
+      </w:r>
+      <w:r>
+        <w:rPr>
+          <w:lang w:val="nl"/>
+        </w:rPr>
+        <w:t xml:space="preserve"> </w:t>
+      </w:r>
+      <w:r>
+        <w:rPr>
+          <w:rStyle w:val="VerbatimChar"/>
+          <w:lang w:val="nl"/>
+        </w:rPr>
+        <w:t xml:space="preserve">/p/&lt;naam&gt;</w:t>
+      </w:r>
+      <w:r>
+        <w:rPr>
+          <w:lang w:val="nl"/>
+        </w:rPr>
+        <w:t xml:space="preserve">.</w:t>
+      </w:r>
+    </w:p>
+    <w:p>
+      <w:r>
+        <w:pict>
+          <v:rect style="width:0;height:1.5pt" o:hralign="center" o:hrstd="t" o:hr="t"/>
+        </w:pict>
+      </w:r>
+    </w:p>
+    <w:bookmarkEnd w:id="21"/>
+    <w:bookmarkStart w:id="22" w:name="een-pagina-verwijderen"/>
+    <w:p>
+      <w:pPr>
+        <w:pStyle w:val="Heading1"/>
+      </w:pPr>
+      <w:r>
+        <w:rPr>
+          <w:lang w:val="nl"/>
+        </w:rPr>
+        <w:t xml:space="preserve">Een pagina verwijderen</w:t>
+      </w:r>
+    </w:p>
+    <w:p>
+      <w:pPr>
+        <w:pStyle w:val="BlockText"/>
+      </w:pPr>
+      <w:r>
+        <w:rPr>
+          <w:b/>
+          <w:bCs/>
+          <w:lang w:val="nl"/>
+        </w:rPr>
+        <w:t xml:space="preserve">In het kort:</w:t>
+      </w:r>
+      <w:r>
+        <w:rPr>
+          <w:lang w:val="nl"/>
+        </w:rPr>
+        <w:t xml:space="preserve"> </w:t>
+      </w:r>
+      <w:r>
+        <w:rPr>
+          <w:lang w:val="nl"/>
+        </w:rPr>
+        <w:t xml:space="preserve">onderaan een pagina staat "Pagina verwijderen". De pagina, alle versies en de</w:t>
+      </w:r>
+      <w:r>
+        <w:rPr>
+          <w:lang w:val="nl"/>
+        </w:rPr>
+        <w:t xml:space="preserve"> </w:t>
+      </w:r>
+      <w:r>
+        <w:rPr>
+          <w:lang w:val="nl"/>
+        </w:rPr>
+        <w:t xml:space="preserve">afbeeldingen verdwijnen; aanmeldingen en de anonieme cijfers blijven.</w:t>
+      </w:r>
+    </w:p>
+    <w:p>
+      <w:pPr>
+        <w:pStyle w:val="FirstParagraph"/>
+      </w:pPr>
+      <w:r>
+        <w:rPr>
+          <w:lang w:val="nl"/>
+        </w:rPr>
+        <w:t xml:space="preserve">Onderaan het scherm van een pagina staat het blok</w:t>
+      </w:r>
+      <w:r>
+        <w:rPr>
+          <w:lang w:val="nl"/>
+        </w:rPr>
+        <w:t xml:space="preserve"> </w:t>
+      </w:r>
+      <w:r>
+        <w:rPr>
+          <w:b/>
+          <w:bCs/>
+          <w:lang w:val="nl"/>
+        </w:rPr>
+        <w:t xml:space="preserve">Verwijderen</w:t>
+      </w:r>
+      <w:r>
+        <w:rPr>
+          <w:lang w:val="nl"/>
+        </w:rPr>
+        <w:t xml:space="preserve"> </w:t>
+      </w:r>
+      <w:r>
+        <w:rPr>
+          <w:lang w:val="nl"/>
+        </w:rPr>
+        <w:t xml:space="preserve">(alleen als je het recht hebt om</w:t>
+      </w:r>
+      <w:r>
+        <w:rPr>
+          <w:lang w:val="nl"/>
+        </w:rPr>
+        <w:t xml:space="preserve"> </w:t>
+      </w:r>
+      <w:r>
+        <w:rPr>
+          <w:lang w:val="nl"/>
+        </w:rPr>
+        <w:t xml:space="preserve">pagina's te verwijderen). Na een bevestiging verdwijnt de pagina van het web, samen met alle</w:t>
+      </w:r>
+      <w:r>
+        <w:rPr>
+          <w:lang w:val="nl"/>
+        </w:rPr>
+        <w:t xml:space="preserve"> </w:t>
+      </w:r>
+      <w:r>
+        <w:rPr>
+          <w:lang w:val="nl"/>
+        </w:rPr>
+        <w:t xml:space="preserve">versies en geüploade bestanden. Aanmeldingen die er ooit via binnenkwamen blijven staan, en de</w:t>
+      </w:r>
+      <w:r>
+        <w:rPr>
+          <w:lang w:val="nl"/>
+        </w:rPr>
+        <w:t xml:space="preserve"> </w:t>
+      </w:r>
+      <w:r>
+        <w:rPr>
+          <w:lang w:val="nl"/>
+        </w:rPr>
+        <w:t xml:space="preserve">statistiek blijft anoniem bewaard. Dit is niet terug te draaien.</w:t>
+      </w:r>
+    </w:p>
+    <w:p>
+      <w:pPr>
+        <w:pStyle w:val="BodyText"/>
+      </w:pPr>
+      <w:r>
+        <w:rPr>
+          <w:lang w:val="nl"/>
+        </w:rPr>
+        <w:t xml:space="preserve">Wil je een pagina alleen tijdelijk offline halen, zet de status dan terug op</w:t>
+      </w:r>
+      <w:r>
+        <w:rPr>
+          <w:lang w:val="nl"/>
+        </w:rPr>
+        <w:t xml:space="preserve"> </w:t>
+      </w:r>
+      <w:r>
+        <w:rPr>
+          <w:b/>
+          <w:bCs/>
+          <w:lang w:val="nl"/>
+        </w:rPr>
+        <w:t xml:space="preserve">Concept</w:t>
+      </w:r>
+      <w:r>
+        <w:rPr>
+          <w:lang w:val="nl"/>
+        </w:rPr>
+        <w:t xml:space="preserve">.</w:t>
+      </w:r>
+    </w:p>
+    <w:p>
+      <w:r>
+        <w:pict>
+          <v:rect style="width:0;height:1.5pt" o:hralign="center" o:hrstd="t" o:hr="t"/>
+        </w:pict>
+      </w:r>
+    </w:p>
+    <w:bookmarkEnd w:id="22"/>
+    <w:bookmarkStart w:id="23" w:name="als-de-pagina-niet-laadt"/>
+    <w:p>
+      <w:pPr>
+        <w:pStyle w:val="Heading1"/>
+      </w:pPr>
+      <w:r>
+        <w:rPr>
+          <w:lang w:val="nl"/>
+        </w:rPr>
+        <w:t xml:space="preserve">Als de pagina niet laadt</w:t>
+      </w:r>
+    </w:p>
+    <w:p>
+      <w:pPr>
+        <w:pStyle w:val="BlockText"/>
+      </w:pPr>
+      <w:r>
+        <w:rPr>
+          <w:b/>
+          <w:bCs/>
+          <w:lang w:val="nl"/>
+        </w:rPr>
+        <w:t xml:space="preserve">In het kort:</w:t>
+      </w:r>
+      <w:r>
+        <w:rPr>
+          <w:lang w:val="nl"/>
+        </w:rPr>
+        <w:t xml:space="preserve"> </w:t>
+      </w:r>
+      <w:r>
+        <w:rPr>
+          <w:lang w:val="nl"/>
+        </w:rPr>
+        <w:t xml:space="preserve">controleer de status, of er een bevestigde versie live staat, en of er externe</w:t>
+      </w:r>
+      <w:r>
+        <w:rPr>
+          <w:lang w:val="nl"/>
+        </w:rPr>
+        <w:t xml:space="preserve"> </w:t>
+      </w:r>
+      <w:r>
+        <w:rPr>
+          <w:lang w:val="nl"/>
+        </w:rPr>
+        <w:t xml:space="preserve">bronnen worden geblokkeerd.</w:t>
+      </w:r>
+    </w:p>
+    <w:p>
+      <w:pPr>
+        <w:pStyle w:val="Compact"/>
+        <w:numPr>
+          <w:ilvl w:val="0"/>
+          <w:numId w:val="1008"/>
+        </w:numPr>
+      </w:pPr>
+      <w:r>
+        <w:rPr>
+          <w:b/>
+          <w:bCs/>
+          <w:lang w:val="nl"/>
+        </w:rPr>
+        <w:t xml:space="preserve">404 terwijl de pagina bestaat</w:t>
+      </w:r>
+      <w:r>
+        <w:rPr>
+          <w:lang w:val="nl"/>
+        </w:rPr>
+        <w:t xml:space="preserve">: staat de status op Gepubliceerd? En staat er een</w:t>
+      </w:r>
+      <w:r>
+        <w:rPr>
+          <w:lang w:val="nl"/>
+        </w:rPr>
+        <w:t xml:space="preserve"> </w:t>
+      </w:r>
+      <w:r>
+        <w:rPr>
+          <w:lang w:val="nl"/>
+        </w:rPr>
+        <w:t xml:space="preserve">bevestigde versie live (niet "Geen ontwerp")? Werkt</w:t>
+      </w:r>
+      <w:r>
+        <w:rPr>
+          <w:lang w:val="nl"/>
+        </w:rPr>
+        <w:t xml:space="preserve"> </w:t>
+      </w:r>
+      <w:r>
+        <w:rPr>
+          <w:rStyle w:val="VerbatimChar"/>
+          <w:lang w:val="nl"/>
+        </w:rPr>
+        <w:t xml:space="preserve">/p/&lt;naam&gt;</w:t>
+      </w:r>
+      <w:r>
+        <w:rPr>
+          <w:lang w:val="nl"/>
+        </w:rPr>
+        <w:t xml:space="preserve"> </w:t>
+      </w:r>
+      <w:r>
+        <w:rPr>
+          <w:lang w:val="nl"/>
+        </w:rPr>
+        <w:t xml:space="preserve">niet maar</w:t>
+      </w:r>
+      <w:r>
+        <w:rPr>
+          <w:lang w:val="nl"/>
+        </w:rPr>
+        <w:t xml:space="preserve"> </w:t>
+      </w:r>
+      <w:r>
+        <w:rPr>
+          <w:rStyle w:val="VerbatimChar"/>
+          <w:lang w:val="nl"/>
+        </w:rPr>
+        <w:t xml:space="preserve">/p.php?s=&lt;naam&gt;</w:t>
+      </w:r>
+      <w:r>
+        <w:rPr>
+          <w:lang w:val="nl"/>
+        </w:rPr>
+        <w:t xml:space="preserve"> </w:t>
+      </w:r>
+      <w:r>
+        <w:rPr>
+          <w:lang w:val="nl"/>
+        </w:rPr>
+        <w:t xml:space="preserve">wel, dan ontbreekt de rewrite-regel in</w:t>
+      </w:r>
+      <w:r>
+        <w:rPr>
+          <w:lang w:val="nl"/>
+        </w:rPr>
+        <w:t xml:space="preserve"> </w:t>
+      </w:r>
+      <w:r>
+        <w:rPr>
+          <w:rStyle w:val="VerbatimChar"/>
+          <w:lang w:val="nl"/>
+        </w:rPr>
+        <w:t xml:space="preserve">.htaccess</w:t>
+      </w:r>
+      <w:r>
+        <w:rPr>
+          <w:lang w:val="nl"/>
+        </w:rPr>
+        <w:t xml:space="preserve">; het overzichtsscherm laat dan zien welke</w:t>
+      </w:r>
+      <w:r>
+        <w:rPr>
+          <w:lang w:val="nl"/>
+        </w:rPr>
+        <w:t xml:space="preserve"> </w:t>
+      </w:r>
+      <w:r>
+        <w:rPr>
+          <w:lang w:val="nl"/>
+        </w:rPr>
+        <w:t xml:space="preserve">regels erin moeten.</w:t>
+      </w:r>
+    </w:p>
+    <w:p>
+      <w:pPr>
+        <w:pStyle w:val="Compact"/>
+        <w:numPr>
+          <w:ilvl w:val="0"/>
+          <w:numId w:val="1008"/>
+        </w:numPr>
+      </w:pPr>
+      <w:r>
+        <w:rPr>
+          <w:b/>
+          <w:bCs/>
+          <w:lang w:val="nl"/>
+        </w:rPr>
+        <w:t xml:space="preserve">De pagina ziet er kaal uit</w:t>
+      </w:r>
+      <w:r>
+        <w:rPr>
+          <w:lang w:val="nl"/>
+        </w:rPr>
+        <w:t xml:space="preserve">: waarschijnlijk wordt een externe bron geblokkeerd. Kijk</w:t>
+      </w:r>
+      <w:r>
+        <w:rPr>
+          <w:lang w:val="nl"/>
+        </w:rPr>
+        <w:t xml:space="preserve"> </w:t>
+      </w:r>
+      <w:r>
+        <w:rPr>
+          <w:lang w:val="nl"/>
+        </w:rPr>
+        <w:t xml:space="preserve">in het rapport van de versie welke hosts erin zitten en sta ze toe, of zet de opmaak in</w:t>
+      </w:r>
+      <w:r>
+        <w:rPr>
+          <w:lang w:val="nl"/>
+        </w:rPr>
+        <w:t xml:space="preserve"> </w:t>
+      </w:r>
+      <w:r>
+        <w:rPr>
+          <w:lang w:val="nl"/>
+        </w:rPr>
+        <w:t xml:space="preserve">het bestand zelf.</w:t>
+      </w:r>
+    </w:p>
+    <w:p>
+      <w:pPr>
+        <w:pStyle w:val="Compact"/>
+        <w:numPr>
+          <w:ilvl w:val="0"/>
+          <w:numId w:val="1008"/>
+        </w:numPr>
+      </w:pPr>
+      <w:r>
+        <w:rPr>
+          <w:b/>
+          <w:bCs/>
+          <w:lang w:val="nl"/>
+        </w:rPr>
+        <w:t xml:space="preserve">Het formulier staat er niet</w:t>
+      </w:r>
+      <w:r>
+        <w:rPr>
+          <w:lang w:val="nl"/>
+        </w:rPr>
+        <w:t xml:space="preserve">:</w:t>
+      </w:r>
+      <w:r>
+        <w:rPr>
+          <w:lang w:val="nl"/>
+        </w:rPr>
+        <w:t xml:space="preserve"> </w:t>
+      </w:r>
+      <w:r>
+        <w:rPr>
+          <w:rStyle w:val="VerbatimChar"/>
+          <w:lang w:val="nl"/>
+        </w:rPr>
+        <w:t xml:space="preserve">[[formulier]]</w:t>
+      </w:r>
+      <w:r>
+        <w:rPr>
+          <w:lang w:val="nl"/>
+        </w:rPr>
+        <w:t xml:space="preserve"> </w:t>
+      </w:r>
+      <w:r>
+        <w:rPr>
+          <w:lang w:val="nl"/>
+        </w:rPr>
+        <w:t xml:space="preserve">ontbreekt in het ontwerp, of het seizoen</w:t>
+      </w:r>
+      <w:r>
+        <w:rPr>
+          <w:lang w:val="nl"/>
+        </w:rPr>
+        <w:t xml:space="preserve"> </w:t>
+      </w:r>
+      <w:r>
+        <w:rPr>
+          <w:lang w:val="nl"/>
+        </w:rPr>
+        <w:t xml:space="preserve">staat niet op "open". In dat laatste geval verschijnt er een melding dat de aanmelding</w:t>
+      </w:r>
+      <w:r>
+        <w:rPr>
+          <w:lang w:val="nl"/>
+        </w:rPr>
+        <w:t xml:space="preserve"> </w:t>
+      </w:r>
+      <w:r>
+        <w:rPr>
+          <w:lang w:val="nl"/>
+        </w:rPr>
+        <w:t xml:space="preserve">gesloten is.</w:t>
+      </w:r>
+    </w:p>
+    <w:p>
+      <w:pPr>
+        <w:pStyle w:val="Compact"/>
+        <w:numPr>
+          <w:ilvl w:val="0"/>
+          <w:numId w:val="1008"/>
         </w:numPr>
       </w:pPr>
       <w:r>
@@ -5957,6 +6245,9 @@
     <w:abstractNumId w:val="991"/>
   </w:num>
   <w:num w:numId="1006">
+    <w:abstractNumId w:val="991"/>
+  </w:num>
+  <w:num w:numId="1007">
     <w:abstractNumId w:val="99411"/>
     <w:lvlOverride w:ilvl="0">
       <w:startOverride w:val="1"/>
@@ -5986,7 +6277,7 @@
       <w:startOverride w:val="1"/>
     </w:lvlOverride>
   </w:num>
-  <w:num w:numId="1007">
+  <w:num w:numId="1008">
     <w:abstractNumId w:val="991"/>
   </w:num>
 </w:numbering>

</xml_diff>

<commit_message>
Startpagina van het domein: wervingspagina als voorpagina voor Google
- Instelling paginas.startpagina (vinkje bij Gegevens van een pagina, verhuist mee bij hernoemen)
- index.php: niet ingelogd + gepubliceerde startpagina -> 302 naar /p/<slug>; anders login zoals voorheen
- index.php start alleen een sessie als er al een sessiecookie is (geen cookie voor nieuwe bezoekers/Google)
- Logboeklabel, handleiding wervingspagina's
</commit_message>
<xml_diff>
--- a/docs/handleiding/word/landingspaginas.docx
+++ b/docs/handleiding/word/landingspaginas.docx
@@ -4102,6 +4102,173 @@
     <w:p>
       <w:pPr>
         <w:pStyle w:val="FirstParagraph"/>
+      </w:pPr>
+      <w:r>
+        <w:rPr>
+          <w:b/>
+          <w:bCs/>
+          <w:lang w:val="nl"/>
+        </w:rPr>
+        <w:t xml:space="preserve">Startpagina van het domein.</w:t>
+      </w:r>
+      <w:r>
+        <w:rPr>
+          <w:lang w:val="nl"/>
+        </w:rPr>
+        <w:t xml:space="preserve"> </w:t>
+      </w:r>
+      <w:r>
+        <w:rPr>
+          <w:lang w:val="nl"/>
+        </w:rPr>
+        <w:t xml:space="preserve">Vink bij "Gegevens"</w:t>
+      </w:r>
+      <w:r>
+        <w:rPr>
+          <w:lang w:val="nl"/>
+        </w:rPr>
+        <w:t xml:space="preserve"> </w:t>
+      </w:r>
+      <w:r>
+        <w:rPr>
+          <w:b/>
+          <w:bCs/>
+          <w:lang w:val="nl"/>
+        </w:rPr>
+        <w:t xml:space="preserve">Startpagina van sollicitatie.paal13.com</w:t>
+      </w:r>
+      <w:r>
+        <w:rPr>
+          <w:lang w:val="nl"/>
+        </w:rPr>
+        <w:t xml:space="preserve"> </w:t>
+      </w:r>
+      <w:r>
+        <w:rPr>
+          <w:lang w:val="nl"/>
+        </w:rPr>
+        <w:t xml:space="preserve">aan</w:t>
+      </w:r>
+      <w:r>
+        <w:rPr>
+          <w:lang w:val="nl"/>
+        </w:rPr>
+        <w:t xml:space="preserve"> </w:t>
+      </w:r>
+      <w:r>
+        <w:rPr>
+          <w:lang w:val="nl"/>
+        </w:rPr>
+        <w:t xml:space="preserve">bij de belangrijkste wervingspagina. Wie dan naar</w:t>
+      </w:r>
+      <w:r>
+        <w:rPr>
+          <w:lang w:val="nl"/>
+        </w:rPr>
+        <w:t xml:space="preserve"> </w:t>
+      </w:r>
+      <w:r>
+        <w:rPr>
+          <w:rStyle w:val="VerbatimChar"/>
+          <w:lang w:val="nl"/>
+        </w:rPr>
+        <w:t xml:space="preserve">https://sollicitatie.paal13.com/</w:t>
+      </w:r>
+      <w:r>
+        <w:rPr>
+          <w:lang w:val="nl"/>
+        </w:rPr>
+        <w:t xml:space="preserve"> </w:t>
+      </w:r>
+      <w:r>
+        <w:rPr>
+          <w:lang w:val="nl"/>
+        </w:rPr>
+        <w:t xml:space="preserve">gaat en niet is</w:t>
+      </w:r>
+      <w:r>
+        <w:rPr>
+          <w:lang w:val="nl"/>
+        </w:rPr>
+        <w:t xml:space="preserve"> </w:t>
+      </w:r>
+      <w:r>
+        <w:rPr>
+          <w:lang w:val="nl"/>
+        </w:rPr>
+        <w:t xml:space="preserve">ingelogd, komt op die pagina uit; ingelogde sollicitanten en beheerders gaan naar hun eigen</w:t>
+      </w:r>
+      <w:r>
+        <w:rPr>
+          <w:lang w:val="nl"/>
+        </w:rPr>
+        <w:t xml:space="preserve"> </w:t>
+      </w:r>
+      <w:r>
+        <w:rPr>
+          <w:lang w:val="nl"/>
+        </w:rPr>
+        <w:t xml:space="preserve">omgeving. Dat is goed voor Google (de voorpagina is het sterkste adres) en voor bezoekers die het</w:t>
+      </w:r>
+      <w:r>
+        <w:rPr>
+          <w:lang w:val="nl"/>
+        </w:rPr>
+        <w:t xml:space="preserve"> </w:t>
+      </w:r>
+      <w:r>
+        <w:rPr>
+          <w:lang w:val="nl"/>
+        </w:rPr>
+        <w:t xml:space="preserve">adres intypen. Zet op die pagina wel een link "Al gesolliciteerd? Log in" naar</w:t>
+      </w:r>
+      <w:r>
+        <w:rPr>
+          <w:lang w:val="nl"/>
+        </w:rPr>
+        <w:t xml:space="preserve"> </w:t>
+      </w:r>
+      <w:r>
+        <w:rPr>
+          <w:rStyle w:val="VerbatimChar"/>
+          <w:lang w:val="nl"/>
+        </w:rPr>
+        <w:t xml:space="preserve">/portaal/</w:t>
+      </w:r>
+      <w:r>
+        <w:rPr>
+          <w:lang w:val="nl"/>
+        </w:rPr>
+        <w:t xml:space="preserve">. Er is</w:t>
+      </w:r>
+      <w:r>
+        <w:rPr>
+          <w:lang w:val="nl"/>
+        </w:rPr>
+        <w:t xml:space="preserve"> </w:t>
+      </w:r>
+      <w:r>
+        <w:rPr>
+          <w:lang w:val="nl"/>
+        </w:rPr>
+        <w:t xml:space="preserve">maar één startpagina; staat de pagina niet op Gepubliceerd, dan gaat de voorpagina gewoon naar het</w:t>
+      </w:r>
+      <w:r>
+        <w:rPr>
+          <w:lang w:val="nl"/>
+        </w:rPr>
+        <w:t xml:space="preserve"> </w:t>
+      </w:r>
+      <w:r>
+        <w:rPr>
+          <w:lang w:val="nl"/>
+        </w:rPr>
+        <w:t xml:space="preserve">inloggen.</w:t>
+      </w:r>
+    </w:p>
+    <w:p>
+      <w:pPr>
+        <w:pStyle w:val="BodyText"/>
       </w:pPr>
       <w:r>
         <w:rPr>

</xml_diff>

<commit_message>
2.127.1: salaristabel per leeftijd en diploma, altijd indicatief
- pag_salaris_kolommen(): functies met factor (zonder vast weekbedrag); cellen = minimumuurloon jul_sep x factor, '—' buiten de leeftijdsgrenzen (met tekst voor schermlezers)
- pag_salaris_disclaimer() altijd onder de tabel en in de vacaturebeschrijving; [[uurloon_vanaf]] met '(indicatief)'
- JobPosting baseSalary min/max over alle diploma's; handleiding wervingspagina's bijgewerkt
</commit_message>
<xml_diff>
--- a/docs/handleiding/word/landingspaginas.docx
+++ b/docs/handleiding/word/landingspaginas.docx
@@ -1543,7 +1543,7 @@
               <w:rPr>
                 <w:lang w:val="nl"/>
               </w:rPr>
-              <w:t xml:space="preserve">Het laagste uurloon vanaf 16 jaar, bijvoorbeeld "€ 4,97" (zonder vakantietoeslag)</w:t>
+              <w:t xml:space="preserve">Het laagste uurloon vanaf 16 jaar, bijvoorbeeld "€ 4,97 (indicatief)" (zonder vakantietoeslag)</w:t>
             </w:r>
           </w:p>
         </w:tc>
@@ -1574,7 +1574,7 @@
               <w:rPr>
                 <w:lang w:val="nl"/>
               </w:rPr>
-              <w:t xml:space="preserve">Een tabel met het uurloon per leeftijd (juni en juli–september), met een regel over de vakantietoeslag eronder</w:t>
+              <w:t xml:space="preserve">Een tabel met een rij per leeftijd en een kolom per diploma, met de vakantietoeslag en de vermelding "indicatief" eronder</w:t>
             </w:r>
           </w:p>
         </w:tc>
@@ -2008,39 +2008,31 @@
         <w:rPr>
           <w:lang w:val="nl"/>
         </w:rPr>
-        <w:t xml:space="preserve">Het loon komt uit</w:t>
-      </w:r>
-      <w:r>
-        <w:rPr>
-          <w:lang w:val="nl"/>
-        </w:rPr>
-        <w:t xml:space="preserve"> </w:t>
-      </w:r>
-      <w:r>
-        <w:rPr>
-          <w:b/>
-          <w:bCs/>
-          <w:lang w:val="nl"/>
-        </w:rPr>
-        <w:t xml:space="preserve">Instellingen › Lonen &amp; budget</w:t>
-      </w:r>
-      <w:r>
-        <w:rPr>
-          <w:lang w:val="nl"/>
-        </w:rPr>
-        <w:t xml:space="preserve">, van het kalenderjaar van het seizoen. Het is</w:t>
-      </w:r>
-      <w:r>
-        <w:rPr>
-          <w:lang w:val="nl"/>
-        </w:rPr>
-        <w:t xml:space="preserve"> </w:t>
-      </w:r>
-      <w:r>
-        <w:rPr>
-          <w:lang w:val="nl"/>
-        </w:rPr>
-        <w:t xml:space="preserve">het wettelijke minimum(jeugd)loon per uur, zonder vakantietoeslag.</w:t>
+        <w:t xml:space="preserve">Het loon rekent zoals de loonplanning: het minimum(jeugd)uurloon van de leeftijd (Instellingen ›</w:t>
+      </w:r>
+      <w:r>
+        <w:rPr>
+          <w:lang w:val="nl"/>
+        </w:rPr>
+        <w:t xml:space="preserve"> </w:t>
+      </w:r>
+      <w:r>
+        <w:rPr>
+          <w:lang w:val="nl"/>
+        </w:rPr>
+        <w:t xml:space="preserve">Lonen &amp; budget, kalenderjaar van het seizoen, tarief juli–september) × de factor van het diploma</w:t>
+      </w:r>
+      <w:r>
+        <w:rPr>
+          <w:lang w:val="nl"/>
+        </w:rPr>
+        <w:t xml:space="preserve"> </w:t>
+      </w:r>
+      <w:r>
+        <w:rPr>
+          <w:lang w:val="nl"/>
+        </w:rPr>
+        <w:t xml:space="preserve">(Instellingen › Functies &amp; factoren). Bruto per uur, zonder vakantietoeslag.</w:t>
       </w:r>
     </w:p>
     <w:p>
@@ -2066,31 +2058,139 @@
         <w:rPr>
           <w:lang w:val="nl"/>
         </w:rPr>
-        <w:t xml:space="preserve">De salaristabel begint bij 16 jaar. De hoogste leeftijden met hetzelfde loon worden één regel,</w:t>
-      </w:r>
-      <w:r>
-        <w:rPr>
-          <w:lang w:val="nl"/>
-        </w:rPr>
-        <w:t xml:space="preserve"> </w:t>
-      </w:r>
-      <w:r>
-        <w:rPr>
-          <w:lang w:val="nl"/>
-        </w:rPr>
-        <w:t xml:space="preserve">bijvoorbeeld "21 jaar en ouder". Voor de opmaak in het ontwerp (bijvoorbeeld in Claude Design):</w:t>
-      </w:r>
-      <w:r>
-        <w:rPr>
-          <w:lang w:val="nl"/>
-        </w:rPr>
-        <w:t xml:space="preserve"> </w:t>
-      </w:r>
-      <w:r>
-        <w:rPr>
-          <w:lang w:val="nl"/>
-        </w:rPr>
-        <w:t xml:space="preserve">de tabel heeft de klasse</w:t>
+        <w:t xml:space="preserve">De salaristabel heeft een</w:t>
+      </w:r>
+      <w:r>
+        <w:rPr>
+          <w:lang w:val="nl"/>
+        </w:rPr>
+        <w:t xml:space="preserve"> </w:t>
+      </w:r>
+      <w:r>
+        <w:rPr>
+          <w:b/>
+          <w:bCs/>
+          <w:lang w:val="nl"/>
+        </w:rPr>
+        <w:t xml:space="preserve">rij per leeftijd</w:t>
+      </w:r>
+      <w:r>
+        <w:rPr>
+          <w:lang w:val="nl"/>
+        </w:rPr>
+        <w:t xml:space="preserve"> </w:t>
+      </w:r>
+      <w:r>
+        <w:rPr>
+          <w:lang w:val="nl"/>
+        </w:rPr>
+        <w:t xml:space="preserve">(vanaf 16 jaar) en een</w:t>
+      </w:r>
+      <w:r>
+        <w:rPr>
+          <w:lang w:val="nl"/>
+        </w:rPr>
+        <w:t xml:space="preserve"> </w:t>
+      </w:r>
+      <w:r>
+        <w:rPr>
+          <w:b/>
+          <w:bCs/>
+          <w:lang w:val="nl"/>
+        </w:rPr>
+        <w:t xml:space="preserve">kolom per diploma</w:t>
+      </w:r>
+      <w:r>
+        <w:rPr>
+          <w:lang w:val="nl"/>
+        </w:rPr>
+        <w:t xml:space="preserve">: alle</w:t>
+      </w:r>
+      <w:r>
+        <w:rPr>
+          <w:lang w:val="nl"/>
+        </w:rPr>
+        <w:t xml:space="preserve"> </w:t>
+      </w:r>
+      <w:r>
+        <w:rPr>
+          <w:lang w:val="nl"/>
+        </w:rPr>
+        <w:t xml:space="preserve">functies met een factor, in hun volgorde (de postcommandant met een vast weekbedrag niet). Valt een</w:t>
+      </w:r>
+      <w:r>
+        <w:rPr>
+          <w:lang w:val="nl"/>
+        </w:rPr>
+        <w:t xml:space="preserve"> </w:t>
+      </w:r>
+      <w:r>
+        <w:rPr>
+          <w:lang w:val="nl"/>
+        </w:rPr>
+        <w:t xml:space="preserve">leeftijd buiten de grenzen van een functie (bijvoorbeeld Senior pas vanaf 18), dan staat er "—". De</w:t>
+      </w:r>
+      <w:r>
+        <w:rPr>
+          <w:lang w:val="nl"/>
+        </w:rPr>
+        <w:t xml:space="preserve"> </w:t>
+      </w:r>
+      <w:r>
+        <w:rPr>
+          <w:lang w:val="nl"/>
+        </w:rPr>
+        <w:t xml:space="preserve">hoogste leeftijden met overal hetzelfde loon worden één regel, bijvoorbeeld "21 jaar en ouder".</w:t>
+      </w:r>
+      <w:r>
+        <w:rPr>
+          <w:lang w:val="nl"/>
+        </w:rPr>
+        <w:t xml:space="preserve"> </w:t>
+      </w:r>
+      <w:r>
+        <w:rPr>
+          <w:lang w:val="nl"/>
+        </w:rPr>
+        <w:t xml:space="preserve">Onder de tabel staat</w:t>
+      </w:r>
+      <w:r>
+        <w:rPr>
+          <w:lang w:val="nl"/>
+        </w:rPr>
+        <w:t xml:space="preserve"> </w:t>
+      </w:r>
+      <w:r>
+        <w:rPr>
+          <w:b/>
+          <w:bCs/>
+          <w:lang w:val="nl"/>
+        </w:rPr>
+        <w:t xml:space="preserve">altijd</w:t>
+      </w:r>
+      <w:r>
+        <w:rPr>
+          <w:lang w:val="nl"/>
+        </w:rPr>
+        <w:t xml:space="preserve"> </w:t>
+      </w:r>
+      <w:r>
+        <w:rPr>
+          <w:lang w:val="nl"/>
+        </w:rPr>
+        <w:t xml:space="preserve">dat de bedragen indicatief zijn en kunnen veranderen, afhankelijk</w:t>
+      </w:r>
+      <w:r>
+        <w:rPr>
+          <w:lang w:val="nl"/>
+        </w:rPr>
+        <w:t xml:space="preserve"> </w:t>
+      </w:r>
+      <w:r>
+        <w:rPr>
+          <w:lang w:val="nl"/>
+        </w:rPr>
+        <w:t xml:space="preserve">van je situatie en gegevens; ook</w:t>
       </w:r>
       <w:r>
         <w:rPr>
@@ -2103,6 +2203,54 @@
           <w:rStyle w:val="VerbatimChar"/>
           <w:lang w:val="nl"/>
         </w:rPr>
+        <w:t xml:space="preserve">[[uurloon_vanaf]]</w:t>
+      </w:r>
+      <w:r>
+        <w:rPr>
+          <w:lang w:val="nl"/>
+        </w:rPr>
+        <w:t xml:space="preserve"> </w:t>
+      </w:r>
+      <w:r>
+        <w:rPr>
+          <w:lang w:val="nl"/>
+        </w:rPr>
+        <w:t xml:space="preserve">krijgt "(indicatief)" mee. Een functie</w:t>
+      </w:r>
+      <w:r>
+        <w:rPr>
+          <w:lang w:val="nl"/>
+        </w:rPr>
+        <w:t xml:space="preserve"> </w:t>
+      </w:r>
+      <w:r>
+        <w:rPr>
+          <w:lang w:val="nl"/>
+        </w:rPr>
+        <w:t xml:space="preserve">hernoemen of een factor wijzigen bij Functies &amp; factoren past de tabel op alle pagina's meteen aan.</w:t>
+      </w:r>
+    </w:p>
+    <w:p>
+      <w:pPr>
+        <w:pStyle w:val="BodyText"/>
+      </w:pPr>
+      <w:r>
+        <w:rPr>
+          <w:lang w:val="nl"/>
+        </w:rPr>
+        <w:t xml:space="preserve">Voor de opmaak in het ontwerp (bijvoorbeeld in Claude Design): de tabel heeft de klasse</w:t>
+      </w:r>
+      <w:r>
+        <w:rPr>
+          <w:lang w:val="nl"/>
+        </w:rPr>
+        <w:t xml:space="preserve"> </w:t>
+      </w:r>
+      <w:r>
+        <w:rPr>
+          <w:rStyle w:val="VerbatimChar"/>
+          <w:lang w:val="nl"/>
+        </w:rPr>
         <w:t xml:space="preserve">p13-salaris</w:t>
       </w:r>
       <w:r>
@@ -2128,19 +2276,19 @@
         <w:rPr>
           <w:lang w:val="nl"/>
         </w:rPr>
-        <w:t xml:space="preserve">, kolomkoppen en per rij de leeftijd</w:t>
-      </w:r>
-      <w:r>
-        <w:rPr>
-          <w:lang w:val="nl"/>
-        </w:rPr>
-        <w:t xml:space="preserve"> </w:t>
-      </w:r>
-      <w:r>
-        <w:rPr>
-          <w:lang w:val="nl"/>
-        </w:rPr>
-        <w:t xml:space="preserve">als rijkop; de regel eronder heeft de klasse</w:t>
+        <w:t xml:space="preserve">, kolomkoppen en per rij de leeftijd als rijkop; de regels eronder</w:t>
+      </w:r>
+      <w:r>
+        <w:rPr>
+          <w:lang w:val="nl"/>
+        </w:rPr>
+        <w:t xml:space="preserve"> </w:t>
+      </w:r>
+      <w:r>
+        <w:rPr>
+          <w:lang w:val="nl"/>
+        </w:rPr>
+        <w:t xml:space="preserve">hebben de klasse</w:t>
       </w:r>
       <w:r>
         <w:rPr>
@@ -2154,6 +2302,25 @@
           <w:lang w:val="nl"/>
         </w:rPr>
         <w:t xml:space="preserve">p13-salaris-noot</w:t>
+      </w:r>
+      <w:r>
+        <w:rPr>
+          <w:lang w:val="nl"/>
+        </w:rPr>
+        <w:t xml:space="preserve">, de disclaimer daarnaast</w:t>
+      </w:r>
+      <w:r>
+        <w:rPr>
+          <w:lang w:val="nl"/>
+        </w:rPr>
+        <w:t xml:space="preserve"> </w:t>
+      </w:r>
+      <w:r>
+        <w:rPr>
+          <w:rStyle w:val="VerbatimChar"/>
+          <w:lang w:val="nl"/>
+        </w:rPr>
+        <w:t xml:space="preserve">p13-salaris-disclaimer</w:t>
       </w:r>
       <w:r>
         <w:rPr>

</xml_diff>